<commit_message>
update print more profesional
</commit_message>
<xml_diff>
--- a/static/GCN_000002.docx
+++ b/static/GCN_000002.docx
@@ -4,7 +4,7 @@
   <w:body>
     <w:p>
       <w:pPr>
-        <w:spacing w:after="0" w:before="120"/>
+        <w:spacing w:after="0" w:before="80"/>
         <w:jc w:val="center"/>
       </w:pPr>
       <w:r>
@@ -14,16 +14,16 @@
           <w:bCs/>
           <w:i w:val="false"/>
           <w:iCs w:val="false"/>
-          <w:color w:val="000000"/>
+          <w:color w:val="008080"/>
           <w:sz w:val="36"/>
           <w:szCs w:val="36"/>
         </w:rPr>
-        <w:t xml:space="preserve">GIẤY CHỨNG NHẬN HIỆU CHUẨN</w:t>
+        <w:t xml:space="preserve">GIẤY CHỨNG NHẬN HIỆU CHUẨN – ĐO LƯỜNG</w:t>
       </w:r>
     </w:p>
     <w:p>
       <w:pPr>
-        <w:spacing w:after="120" w:before="0"/>
+        <w:spacing w:after="100" w:before="0"/>
         <w:jc w:val="center"/>
       </w:pPr>
       <w:r>
@@ -33,11 +33,11 @@
           <w:bCs/>
           <w:i/>
           <w:iCs/>
-          <w:color w:val="1a1a1a"/>
+          <w:color w:val="008080"/>
           <w:sz w:val="32"/>
           <w:szCs w:val="32"/>
         </w:rPr>
-        <w:t xml:space="preserve">CERTIFICATE OF CALIBRATION</w:t>
+        <w:t xml:space="preserve">CERTIFICATE OF CALIBRATION – MEASUREMENT</w:t>
       </w:r>
     </w:p>
     <w:tbl>
@@ -62,24 +62,24 @@
       <w:tr>
         <w:tc>
           <w:tcPr>
-            <w:tcW w:type="dxa" w:w="1675"/>
-            <w:tcBorders>
-              <w:top w:val="single" w:color="000000" w:sz="4"/>
-              <w:left w:val="single" w:color="000000" w:sz="4"/>
-              <w:bottom w:val="single" w:color="000000" w:sz="4"/>
-              <w:right w:val="single" w:color="000000" w:sz="4"/>
-            </w:tcBorders>
-            <w:tcMar>
-              <w:top w:type="dxa" w:w="80"/>
-              <w:left w:type="dxa" w:w="100"/>
-              <w:bottom w:type="dxa" w:w="80"/>
-              <w:right w:type="dxa" w:w="150"/>
-            </w:tcMar>
-            <w:vAlign w:val="center"/>
-          </w:tcPr>
-          <w:p>
-            <w:pPr>
-              <w:spacing w:after="0" w:before="60"/>
+            <w:tcW w:type="dxa" w:w="1500"/>
+            <w:tcBorders>
+              <w:top w:val="none" w:color="auto" w:sz="0"/>
+              <w:left w:val="none" w:color="auto" w:sz="0"/>
+              <w:bottom w:val="none" w:color="auto" w:sz="0"/>
+              <w:right w:val="none" w:color="auto" w:sz="0"/>
+            </w:tcBorders>
+            <w:tcMar>
+              <w:top w:type="dxa" w:w="20"/>
+              <w:left w:type="dxa" w:w="0"/>
+              <w:bottom w:type="dxa" w:w="20"/>
+              <w:right w:type="dxa" w:w="60"/>
+            </w:tcMar>
+            <w:vAlign w:val="center"/>
+          </w:tcPr>
+          <w:p>
+            <w:pPr>
+              <w:spacing w:after="0" w:before="40"/>
               <w:jc w:val="left"/>
             </w:pPr>
             <w:r>
@@ -118,18 +118,18 @@
         </w:tc>
         <w:tc>
           <w:tcPr>
-            <w:tcW w:type="dxa" w:w="3426"/>
-            <w:tcBorders>
-              <w:top w:val="single" w:color="000000" w:sz="4"/>
-              <w:left w:val="single" w:color="000000" w:sz="4"/>
-              <w:bottom w:val="single" w:color="000000" w:sz="4"/>
-              <w:right w:val="single" w:color="000000" w:sz="4"/>
-            </w:tcBorders>
-            <w:tcMar>
-              <w:top w:type="dxa" w:w="80"/>
-              <w:left w:type="dxa" w:w="100"/>
-              <w:bottom w:type="dxa" w:w="80"/>
-              <w:right w:type="dxa" w:w="150"/>
+            <w:tcW w:type="dxa" w:w="3036"/>
+            <w:tcBorders>
+              <w:top w:val="none" w:color="auto" w:sz="0"/>
+              <w:left w:val="none" w:color="auto" w:sz="0"/>
+              <w:bottom w:val="none" w:color="auto" w:sz="0"/>
+              <w:right w:val="none" w:color="auto" w:sz="0"/>
+            </w:tcBorders>
+            <w:tcMar>
+              <w:top w:type="dxa" w:w="20"/>
+              <w:left w:type="dxa" w:w="0"/>
+              <w:bottom w:type="dxa" w:w="20"/>
+              <w:right w:type="dxa" w:w="60"/>
             </w:tcMar>
             <w:vAlign w:val="center"/>
           </w:tcPr>
@@ -155,24 +155,24 @@
         </w:tc>
         <w:tc>
           <w:tcPr>
-            <w:tcW w:type="dxa" w:w="2513"/>
-            <w:tcBorders>
-              <w:top w:val="single" w:color="000000" w:sz="4"/>
-              <w:left w:val="single" w:color="000000" w:sz="4"/>
-              <w:bottom w:val="single" w:color="000000" w:sz="4"/>
-              <w:right w:val="single" w:color="000000" w:sz="4"/>
-            </w:tcBorders>
-            <w:tcMar>
-              <w:top w:type="dxa" w:w="80"/>
-              <w:left w:type="dxa" w:w="100"/>
-              <w:bottom w:type="dxa" w:w="80"/>
-              <w:right w:type="dxa" w:w="150"/>
-            </w:tcMar>
-            <w:vAlign w:val="center"/>
-          </w:tcPr>
-          <w:p>
-            <w:pPr>
-              <w:spacing w:after="0" w:before="60"/>
+            <w:tcW w:type="dxa" w:w="2500"/>
+            <w:tcBorders>
+              <w:top w:val="none" w:color="auto" w:sz="0"/>
+              <w:left w:val="none" w:color="auto" w:sz="0"/>
+              <w:bottom w:val="none" w:color="auto" w:sz="0"/>
+              <w:right w:val="none" w:color="auto" w:sz="0"/>
+            </w:tcBorders>
+            <w:tcMar>
+              <w:top w:type="dxa" w:w="20"/>
+              <w:left w:type="dxa" w:w="0"/>
+              <w:bottom w:type="dxa" w:w="20"/>
+              <w:right w:type="dxa" w:w="60"/>
+            </w:tcMar>
+            <w:vAlign w:val="center"/>
+          </w:tcPr>
+          <w:p>
+            <w:pPr>
+              <w:spacing w:after="0" w:before="40"/>
               <w:jc w:val="left"/>
             </w:pPr>
             <w:r>
@@ -211,18 +211,18 @@
         </w:tc>
         <w:tc>
           <w:tcPr>
-            <w:tcW w:type="dxa" w:w="1458"/>
-            <w:tcBorders>
-              <w:top w:val="single" w:color="000000" w:sz="4"/>
-              <w:left w:val="single" w:color="000000" w:sz="4"/>
-              <w:bottom w:val="single" w:color="000000" w:sz="4"/>
-              <w:right w:val="single" w:color="000000" w:sz="4"/>
-            </w:tcBorders>
-            <w:tcMar>
-              <w:top w:type="dxa" w:w="80"/>
-              <w:left w:type="dxa" w:w="100"/>
-              <w:bottom w:type="dxa" w:w="80"/>
-              <w:right w:type="dxa" w:w="150"/>
+            <w:tcW w:type="dxa" w:w="2036"/>
+            <w:tcBorders>
+              <w:top w:val="none" w:color="auto" w:sz="0"/>
+              <w:left w:val="none" w:color="auto" w:sz="0"/>
+              <w:bottom w:val="none" w:color="auto" w:sz="0"/>
+              <w:right w:val="none" w:color="auto" w:sz="0"/>
+            </w:tcBorders>
+            <w:tcMar>
+              <w:top w:type="dxa" w:w="20"/>
+              <w:left w:type="dxa" w:w="0"/>
+              <w:bottom w:type="dxa" w:w="20"/>
+              <w:right w:type="dxa" w:w="0"/>
             </w:tcMar>
             <w:vAlign w:val="center"/>
           </w:tcPr>
@@ -250,24 +250,24 @@
       <w:tr>
         <w:tc>
           <w:tcPr>
-            <w:tcW w:type="dxa" w:w="1675"/>
-            <w:tcBorders>
-              <w:top w:val="single" w:color="000000" w:sz="4"/>
-              <w:left w:val="single" w:color="000000" w:sz="4"/>
-              <w:bottom w:val="single" w:color="000000" w:sz="4"/>
-              <w:right w:val="single" w:color="000000" w:sz="4"/>
-            </w:tcBorders>
-            <w:tcMar>
-              <w:top w:type="dxa" w:w="80"/>
-              <w:left w:type="dxa" w:w="100"/>
-              <w:bottom w:type="dxa" w:w="80"/>
-              <w:right w:type="dxa" w:w="150"/>
-            </w:tcMar>
-            <w:vAlign w:val="center"/>
-          </w:tcPr>
-          <w:p>
-            <w:pPr>
-              <w:spacing w:after="0" w:before="60"/>
+            <w:tcW w:type="dxa" w:w="1500"/>
+            <w:tcBorders>
+              <w:top w:val="none" w:color="auto" w:sz="0"/>
+              <w:left w:val="none" w:color="auto" w:sz="0"/>
+              <w:bottom w:val="none" w:color="auto" w:sz="0"/>
+              <w:right w:val="none" w:color="auto" w:sz="0"/>
+            </w:tcBorders>
+            <w:tcMar>
+              <w:top w:type="dxa" w:w="20"/>
+              <w:left w:type="dxa" w:w="0"/>
+              <w:bottom w:type="dxa" w:w="20"/>
+              <w:right w:type="dxa" w:w="60"/>
+            </w:tcMar>
+            <w:vAlign w:val="center"/>
+          </w:tcPr>
+          <w:p>
+            <w:pPr>
+              <w:spacing w:after="0" w:before="40"/>
               <w:jc w:val="left"/>
             </w:pPr>
             <w:r>
@@ -306,18 +306,18 @@
         </w:tc>
         <w:tc>
           <w:tcPr>
-            <w:tcW w:type="dxa" w:w="3426"/>
-            <w:tcBorders>
-              <w:top w:val="single" w:color="000000" w:sz="4"/>
-              <w:left w:val="single" w:color="000000" w:sz="4"/>
-              <w:bottom w:val="single" w:color="000000" w:sz="4"/>
-              <w:right w:val="single" w:color="000000" w:sz="4"/>
-            </w:tcBorders>
-            <w:tcMar>
-              <w:top w:type="dxa" w:w="80"/>
-              <w:left w:type="dxa" w:w="100"/>
-              <w:bottom w:type="dxa" w:w="80"/>
-              <w:right w:type="dxa" w:w="150"/>
+            <w:tcW w:type="dxa" w:w="3036"/>
+            <w:tcBorders>
+              <w:top w:val="none" w:color="auto" w:sz="0"/>
+              <w:left w:val="none" w:color="auto" w:sz="0"/>
+              <w:bottom w:val="none" w:color="auto" w:sz="0"/>
+              <w:right w:val="none" w:color="auto" w:sz="0"/>
+            </w:tcBorders>
+            <w:tcMar>
+              <w:top w:type="dxa" w:w="20"/>
+              <w:left w:type="dxa" w:w="0"/>
+              <w:bottom w:type="dxa" w:w="20"/>
+              <w:right w:type="dxa" w:w="60"/>
             </w:tcMar>
             <w:vAlign w:val="center"/>
           </w:tcPr>
@@ -343,24 +343,24 @@
         </w:tc>
         <w:tc>
           <w:tcPr>
-            <w:tcW w:type="dxa" w:w="2513"/>
-            <w:tcBorders>
-              <w:top w:val="single" w:color="000000" w:sz="4"/>
-              <w:left w:val="single" w:color="000000" w:sz="4"/>
-              <w:bottom w:val="single" w:color="000000" w:sz="4"/>
-              <w:right w:val="single" w:color="000000" w:sz="4"/>
-            </w:tcBorders>
-            <w:tcMar>
-              <w:top w:type="dxa" w:w="80"/>
-              <w:left w:type="dxa" w:w="100"/>
-              <w:bottom w:type="dxa" w:w="80"/>
-              <w:right w:type="dxa" w:w="150"/>
-            </w:tcMar>
-            <w:vAlign w:val="center"/>
-          </w:tcPr>
-          <w:p>
-            <w:pPr>
-              <w:spacing w:after="0" w:before="60"/>
+            <w:tcW w:type="dxa" w:w="2500"/>
+            <w:tcBorders>
+              <w:top w:val="none" w:color="auto" w:sz="0"/>
+              <w:left w:val="none" w:color="auto" w:sz="0"/>
+              <w:bottom w:val="none" w:color="auto" w:sz="0"/>
+              <w:right w:val="none" w:color="auto" w:sz="0"/>
+            </w:tcBorders>
+            <w:tcMar>
+              <w:top w:type="dxa" w:w="20"/>
+              <w:left w:type="dxa" w:w="0"/>
+              <w:bottom w:type="dxa" w:w="20"/>
+              <w:right w:type="dxa" w:w="60"/>
+            </w:tcMar>
+            <w:vAlign w:val="center"/>
+          </w:tcPr>
+          <w:p>
+            <w:pPr>
+              <w:spacing w:after="0" w:before="40"/>
               <w:jc w:val="left"/>
             </w:pPr>
             <w:r>
@@ -399,18 +399,18 @@
         </w:tc>
         <w:tc>
           <w:tcPr>
-            <w:tcW w:type="dxa" w:w="1458"/>
-            <w:tcBorders>
-              <w:top w:val="single" w:color="000000" w:sz="4"/>
-              <w:left w:val="single" w:color="000000" w:sz="4"/>
-              <w:bottom w:val="single" w:color="000000" w:sz="4"/>
-              <w:right w:val="single" w:color="000000" w:sz="4"/>
-            </w:tcBorders>
-            <w:tcMar>
-              <w:top w:type="dxa" w:w="80"/>
-              <w:left w:type="dxa" w:w="100"/>
-              <w:bottom w:type="dxa" w:w="80"/>
-              <w:right w:type="dxa" w:w="150"/>
+            <w:tcW w:type="dxa" w:w="2036"/>
+            <w:tcBorders>
+              <w:top w:val="none" w:color="auto" w:sz="0"/>
+              <w:left w:val="none" w:color="auto" w:sz="0"/>
+              <w:bottom w:val="none" w:color="auto" w:sz="0"/>
+              <w:right w:val="none" w:color="auto" w:sz="0"/>
+            </w:tcBorders>
+            <w:tcMar>
+              <w:top w:type="dxa" w:w="20"/>
+              <w:left w:type="dxa" w:w="0"/>
+              <w:bottom w:type="dxa" w:w="20"/>
+              <w:right w:type="dxa" w:w="0"/>
             </w:tcMar>
             <w:vAlign w:val="center"/>
           </w:tcPr>
@@ -438,24 +438,24 @@
       <w:tr>
         <w:tc>
           <w:tcPr>
-            <w:tcW w:type="dxa" w:w="1675"/>
-            <w:tcBorders>
-              <w:top w:val="single" w:color="000000" w:sz="4"/>
-              <w:left w:val="single" w:color="000000" w:sz="4"/>
-              <w:bottom w:val="single" w:color="000000" w:sz="4"/>
-              <w:right w:val="single" w:color="000000" w:sz="4"/>
-            </w:tcBorders>
-            <w:tcMar>
-              <w:top w:type="dxa" w:w="80"/>
-              <w:left w:type="dxa" w:w="100"/>
-              <w:bottom w:type="dxa" w:w="80"/>
-              <w:right w:type="dxa" w:w="150"/>
-            </w:tcMar>
-            <w:vAlign w:val="center"/>
-          </w:tcPr>
-          <w:p>
-            <w:pPr>
-              <w:spacing w:after="0" w:before="60"/>
+            <w:tcW w:type="dxa" w:w="1500"/>
+            <w:tcBorders>
+              <w:top w:val="none" w:color="auto" w:sz="0"/>
+              <w:left w:val="none" w:color="auto" w:sz="0"/>
+              <w:bottom w:val="none" w:color="auto" w:sz="0"/>
+              <w:right w:val="none" w:color="auto" w:sz="0"/>
+            </w:tcBorders>
+            <w:tcMar>
+              <w:top w:type="dxa" w:w="20"/>
+              <w:left w:type="dxa" w:w="0"/>
+              <w:bottom w:type="dxa" w:w="20"/>
+              <w:right w:type="dxa" w:w="60"/>
+            </w:tcMar>
+            <w:vAlign w:val="center"/>
+          </w:tcPr>
+          <w:p>
+            <w:pPr>
+              <w:spacing w:after="0" w:before="40"/>
               <w:jc w:val="left"/>
             </w:pPr>
             <w:r>
@@ -494,18 +494,18 @@
         </w:tc>
         <w:tc>
           <w:tcPr>
-            <w:tcW w:type="dxa" w:w="3426"/>
-            <w:tcBorders>
-              <w:top w:val="single" w:color="000000" w:sz="4"/>
-              <w:left w:val="single" w:color="000000" w:sz="4"/>
-              <w:bottom w:val="single" w:color="000000" w:sz="4"/>
-              <w:right w:val="single" w:color="000000" w:sz="4"/>
-            </w:tcBorders>
-            <w:tcMar>
-              <w:top w:type="dxa" w:w="80"/>
-              <w:left w:type="dxa" w:w="100"/>
-              <w:bottom w:type="dxa" w:w="80"/>
-              <w:right w:type="dxa" w:w="150"/>
+            <w:tcW w:type="dxa" w:w="3036"/>
+            <w:tcBorders>
+              <w:top w:val="none" w:color="auto" w:sz="0"/>
+              <w:left w:val="none" w:color="auto" w:sz="0"/>
+              <w:bottom w:val="none" w:color="auto" w:sz="0"/>
+              <w:right w:val="none" w:color="auto" w:sz="0"/>
+            </w:tcBorders>
+            <w:tcMar>
+              <w:top w:type="dxa" w:w="20"/>
+              <w:left w:type="dxa" w:w="0"/>
+              <w:bottom w:type="dxa" w:w="20"/>
+              <w:right w:type="dxa" w:w="60"/>
             </w:tcMar>
             <w:vAlign w:val="center"/>
           </w:tcPr>
@@ -531,24 +531,24 @@
         </w:tc>
         <w:tc>
           <w:tcPr>
-            <w:tcW w:type="dxa" w:w="2513"/>
-            <w:tcBorders>
-              <w:top w:val="single" w:color="000000" w:sz="4"/>
-              <w:left w:val="single" w:color="000000" w:sz="4"/>
-              <w:bottom w:val="single" w:color="000000" w:sz="4"/>
-              <w:right w:val="single" w:color="000000" w:sz="4"/>
-            </w:tcBorders>
-            <w:tcMar>
-              <w:top w:type="dxa" w:w="80"/>
-              <w:left w:type="dxa" w:w="100"/>
-              <w:bottom w:type="dxa" w:w="80"/>
-              <w:right w:type="dxa" w:w="150"/>
-            </w:tcMar>
-            <w:vAlign w:val="center"/>
-          </w:tcPr>
-          <w:p>
-            <w:pPr>
-              <w:spacing w:after="0" w:before="60"/>
+            <w:tcW w:type="dxa" w:w="2500"/>
+            <w:tcBorders>
+              <w:top w:val="none" w:color="auto" w:sz="0"/>
+              <w:left w:val="none" w:color="auto" w:sz="0"/>
+              <w:bottom w:val="none" w:color="auto" w:sz="0"/>
+              <w:right w:val="none" w:color="auto" w:sz="0"/>
+            </w:tcBorders>
+            <w:tcMar>
+              <w:top w:type="dxa" w:w="20"/>
+              <w:left w:type="dxa" w:w="0"/>
+              <w:bottom w:type="dxa" w:w="20"/>
+              <w:right w:type="dxa" w:w="60"/>
+            </w:tcMar>
+            <w:vAlign w:val="center"/>
+          </w:tcPr>
+          <w:p>
+            <w:pPr>
+              <w:spacing w:after="0" w:before="40"/>
               <w:jc w:val="left"/>
             </w:pPr>
             <w:r>
@@ -587,18 +587,18 @@
         </w:tc>
         <w:tc>
           <w:tcPr>
-            <w:tcW w:type="dxa" w:w="1458"/>
-            <w:tcBorders>
-              <w:top w:val="single" w:color="000000" w:sz="4"/>
-              <w:left w:val="single" w:color="000000" w:sz="4"/>
-              <w:bottom w:val="single" w:color="000000" w:sz="4"/>
-              <w:right w:val="single" w:color="000000" w:sz="4"/>
-            </w:tcBorders>
-            <w:tcMar>
-              <w:top w:type="dxa" w:w="80"/>
-              <w:left w:type="dxa" w:w="100"/>
-              <w:bottom w:type="dxa" w:w="80"/>
-              <w:right w:type="dxa" w:w="150"/>
+            <w:tcW w:type="dxa" w:w="2036"/>
+            <w:tcBorders>
+              <w:top w:val="none" w:color="auto" w:sz="0"/>
+              <w:left w:val="none" w:color="auto" w:sz="0"/>
+              <w:bottom w:val="none" w:color="auto" w:sz="0"/>
+              <w:right w:val="none" w:color="auto" w:sz="0"/>
+            </w:tcBorders>
+            <w:tcMar>
+              <w:top w:type="dxa" w:w="20"/>
+              <w:left w:type="dxa" w:w="0"/>
+              <w:bottom w:type="dxa" w:w="20"/>
+              <w:right w:type="dxa" w:w="0"/>
             </w:tcMar>
             <w:vAlign w:val="center"/>
           </w:tcPr>
@@ -626,24 +626,24 @@
       <w:tr>
         <w:tc>
           <w:tcPr>
-            <w:tcW w:type="dxa" w:w="1675"/>
-            <w:tcBorders>
-              <w:top w:val="single" w:color="000000" w:sz="4"/>
-              <w:left w:val="single" w:color="000000" w:sz="4"/>
-              <w:bottom w:val="single" w:color="000000" w:sz="4"/>
-              <w:right w:val="single" w:color="000000" w:sz="4"/>
-            </w:tcBorders>
-            <w:tcMar>
-              <w:top w:type="dxa" w:w="80"/>
-              <w:left w:type="dxa" w:w="100"/>
-              <w:bottom w:type="dxa" w:w="80"/>
-              <w:right w:type="dxa" w:w="150"/>
-            </w:tcMar>
-            <w:vAlign w:val="center"/>
-          </w:tcPr>
-          <w:p>
-            <w:pPr>
-              <w:spacing w:after="40" w:before="60"/>
+            <w:tcW w:type="dxa" w:w="1500"/>
+            <w:tcBorders>
+              <w:top w:val="none" w:color="auto" w:sz="0"/>
+              <w:left w:val="none" w:color="auto" w:sz="0"/>
+              <w:bottom w:val="none" w:color="auto" w:sz="0"/>
+              <w:right w:val="none" w:color="auto" w:sz="0"/>
+            </w:tcBorders>
+            <w:tcMar>
+              <w:top w:type="dxa" w:w="20"/>
+              <w:left w:type="dxa" w:w="0"/>
+              <w:bottom w:type="dxa" w:w="20"/>
+              <w:right w:type="dxa" w:w="60"/>
+            </w:tcMar>
+            <w:vAlign w:val="center"/>
+          </w:tcPr>
+          <w:p>
+            <w:pPr>
+              <w:spacing w:after="40" w:before="40"/>
               <w:jc w:val="left"/>
             </w:pPr>
             <w:r>
@@ -663,18 +663,18 @@
         </w:tc>
         <w:tc>
           <w:tcPr>
-            <w:tcW w:type="dxa" w:w="3426"/>
-            <w:tcBorders>
-              <w:top w:val="single" w:color="000000" w:sz="4"/>
-              <w:left w:val="single" w:color="000000" w:sz="4"/>
-              <w:bottom w:val="single" w:color="000000" w:sz="4"/>
-              <w:right w:val="single" w:color="000000" w:sz="4"/>
-            </w:tcBorders>
-            <w:tcMar>
-              <w:top w:type="dxa" w:w="80"/>
-              <w:left w:type="dxa" w:w="100"/>
-              <w:bottom w:type="dxa" w:w="80"/>
-              <w:right w:type="dxa" w:w="150"/>
+            <w:tcW w:type="dxa" w:w="3036"/>
+            <w:tcBorders>
+              <w:top w:val="none" w:color="auto" w:sz="0"/>
+              <w:left w:val="none" w:color="auto" w:sz="0"/>
+              <w:bottom w:val="none" w:color="auto" w:sz="0"/>
+              <w:right w:val="none" w:color="auto" w:sz="0"/>
+            </w:tcBorders>
+            <w:tcMar>
+              <w:top w:type="dxa" w:w="20"/>
+              <w:left w:type="dxa" w:w="0"/>
+              <w:bottom w:type="dxa" w:w="20"/>
+              <w:right w:type="dxa" w:w="60"/>
             </w:tcMar>
             <w:vAlign w:val="center"/>
           </w:tcPr>
@@ -700,24 +700,24 @@
         </w:tc>
         <w:tc>
           <w:tcPr>
-            <w:tcW w:type="dxa" w:w="2513"/>
-            <w:tcBorders>
-              <w:top w:val="single" w:color="000000" w:sz="4"/>
-              <w:left w:val="single" w:color="000000" w:sz="4"/>
-              <w:bottom w:val="single" w:color="000000" w:sz="4"/>
-              <w:right w:val="single" w:color="000000" w:sz="4"/>
-            </w:tcBorders>
-            <w:tcMar>
-              <w:top w:type="dxa" w:w="80"/>
-              <w:left w:type="dxa" w:w="100"/>
-              <w:bottom w:type="dxa" w:w="80"/>
-              <w:right w:type="dxa" w:w="150"/>
-            </w:tcMar>
-            <w:vAlign w:val="center"/>
-          </w:tcPr>
-          <w:p>
-            <w:pPr>
-              <w:spacing w:after="40" w:before="60"/>
+            <w:tcW w:type="dxa" w:w="2500"/>
+            <w:tcBorders>
+              <w:top w:val="none" w:color="auto" w:sz="0"/>
+              <w:left w:val="none" w:color="auto" w:sz="0"/>
+              <w:bottom w:val="none" w:color="auto" w:sz="0"/>
+              <w:right w:val="none" w:color="auto" w:sz="0"/>
+            </w:tcBorders>
+            <w:tcMar>
+              <w:top w:type="dxa" w:w="20"/>
+              <w:left w:type="dxa" w:w="0"/>
+              <w:bottom w:type="dxa" w:w="20"/>
+              <w:right w:type="dxa" w:w="60"/>
+            </w:tcMar>
+            <w:vAlign w:val="center"/>
+          </w:tcPr>
+          <w:p>
+            <w:pPr>
+              <w:spacing w:after="40" w:before="40"/>
               <w:jc w:val="left"/>
             </w:pPr>
             <w:r>
@@ -737,18 +737,18 @@
         </w:tc>
         <w:tc>
           <w:tcPr>
-            <w:tcW w:type="dxa" w:w="1458"/>
-            <w:tcBorders>
-              <w:top w:val="single" w:color="000000" w:sz="4"/>
-              <w:left w:val="single" w:color="000000" w:sz="4"/>
-              <w:bottom w:val="single" w:color="000000" w:sz="4"/>
-              <w:right w:val="single" w:color="000000" w:sz="4"/>
-            </w:tcBorders>
-            <w:tcMar>
-              <w:top w:type="dxa" w:w="80"/>
-              <w:left w:type="dxa" w:w="100"/>
-              <w:bottom w:type="dxa" w:w="80"/>
-              <w:right w:type="dxa" w:w="150"/>
+            <w:tcW w:type="dxa" w:w="2036"/>
+            <w:tcBorders>
+              <w:top w:val="none" w:color="auto" w:sz="0"/>
+              <w:left w:val="none" w:color="auto" w:sz="0"/>
+              <w:bottom w:val="none" w:color="auto" w:sz="0"/>
+              <w:right w:val="none" w:color="auto" w:sz="0"/>
+            </w:tcBorders>
+            <w:tcMar>
+              <w:top w:type="dxa" w:w="20"/>
+              <w:left w:type="dxa" w:w="0"/>
+              <w:bottom w:type="dxa" w:w="20"/>
+              <w:right w:type="dxa" w:w="0"/>
             </w:tcMar>
             <w:vAlign w:val="center"/>
           </w:tcPr>
@@ -776,24 +776,24 @@
       <w:tr>
         <w:tc>
           <w:tcPr>
-            <w:tcW w:type="dxa" w:w="1675"/>
-            <w:tcBorders>
-              <w:top w:val="single" w:color="000000" w:sz="4"/>
-              <w:left w:val="single" w:color="000000" w:sz="4"/>
-              <w:bottom w:val="single" w:color="000000" w:sz="4"/>
-              <w:right w:val="single" w:color="000000" w:sz="4"/>
-            </w:tcBorders>
-            <w:tcMar>
-              <w:top w:type="dxa" w:w="80"/>
-              <w:left w:type="dxa" w:w="100"/>
-              <w:bottom w:type="dxa" w:w="80"/>
-              <w:right w:type="dxa" w:w="150"/>
-            </w:tcMar>
-            <w:vAlign w:val="center"/>
-          </w:tcPr>
-          <w:p>
-            <w:pPr>
-              <w:spacing w:after="0" w:before="60"/>
+            <w:tcW w:type="dxa" w:w="1500"/>
+            <w:tcBorders>
+              <w:top w:val="none" w:color="auto" w:sz="0"/>
+              <w:left w:val="none" w:color="auto" w:sz="0"/>
+              <w:bottom w:val="none" w:color="auto" w:sz="0"/>
+              <w:right w:val="none" w:color="auto" w:sz="0"/>
+            </w:tcBorders>
+            <w:tcMar>
+              <w:top w:type="dxa" w:w="20"/>
+              <w:left w:type="dxa" w:w="0"/>
+              <w:bottom w:type="dxa" w:w="20"/>
+              <w:right w:type="dxa" w:w="60"/>
+            </w:tcMar>
+            <w:vAlign w:val="center"/>
+          </w:tcPr>
+          <w:p>
+            <w:pPr>
+              <w:spacing w:after="0" w:before="40"/>
               <w:jc w:val="left"/>
             </w:pPr>
             <w:r>
@@ -832,18 +832,18 @@
         </w:tc>
         <w:tc>
           <w:tcPr>
-            <w:tcW w:type="dxa" w:w="3426"/>
-            <w:tcBorders>
-              <w:top w:val="single" w:color="000000" w:sz="4"/>
-              <w:left w:val="single" w:color="000000" w:sz="4"/>
-              <w:bottom w:val="single" w:color="000000" w:sz="4"/>
-              <w:right w:val="single" w:color="000000" w:sz="4"/>
-            </w:tcBorders>
-            <w:tcMar>
-              <w:top w:type="dxa" w:w="80"/>
-              <w:left w:type="dxa" w:w="100"/>
-              <w:bottom w:type="dxa" w:w="80"/>
-              <w:right w:type="dxa" w:w="150"/>
+            <w:tcW w:type="dxa" w:w="3036"/>
+            <w:tcBorders>
+              <w:top w:val="none" w:color="auto" w:sz="0"/>
+              <w:left w:val="none" w:color="auto" w:sz="0"/>
+              <w:bottom w:val="none" w:color="auto" w:sz="0"/>
+              <w:right w:val="none" w:color="auto" w:sz="0"/>
+            </w:tcBorders>
+            <w:tcMar>
+              <w:top w:type="dxa" w:w="20"/>
+              <w:left w:type="dxa" w:w="0"/>
+              <w:bottom w:type="dxa" w:w="20"/>
+              <w:right w:type="dxa" w:w="60"/>
             </w:tcMar>
             <w:vAlign w:val="center"/>
           </w:tcPr>
@@ -869,24 +869,24 @@
         </w:tc>
         <w:tc>
           <w:tcPr>
-            <w:tcW w:type="dxa" w:w="2513"/>
-            <w:tcBorders>
-              <w:top w:val="single" w:color="000000" w:sz="4"/>
-              <w:left w:val="single" w:color="000000" w:sz="4"/>
-              <w:bottom w:val="single" w:color="000000" w:sz="4"/>
-              <w:right w:val="single" w:color="000000" w:sz="4"/>
-            </w:tcBorders>
-            <w:tcMar>
-              <w:top w:type="dxa" w:w="80"/>
-              <w:left w:type="dxa" w:w="100"/>
-              <w:bottom w:type="dxa" w:w="80"/>
-              <w:right w:type="dxa" w:w="150"/>
-            </w:tcMar>
-            <w:vAlign w:val="center"/>
-          </w:tcPr>
-          <w:p>
-            <w:pPr>
-              <w:spacing w:after="40" w:before="60"/>
+            <w:tcW w:type="dxa" w:w="2500"/>
+            <w:tcBorders>
+              <w:top w:val="none" w:color="auto" w:sz="0"/>
+              <w:left w:val="none" w:color="auto" w:sz="0"/>
+              <w:bottom w:val="none" w:color="auto" w:sz="0"/>
+              <w:right w:val="none" w:color="auto" w:sz="0"/>
+            </w:tcBorders>
+            <w:tcMar>
+              <w:top w:type="dxa" w:w="20"/>
+              <w:left w:type="dxa" w:w="0"/>
+              <w:bottom w:type="dxa" w:w="20"/>
+              <w:right w:type="dxa" w:w="60"/>
+            </w:tcMar>
+            <w:vAlign w:val="center"/>
+          </w:tcPr>
+          <w:p>
+            <w:pPr>
+              <w:spacing w:after="40" w:before="40"/>
               <w:jc w:val="left"/>
             </w:pPr>
             <w:r>
@@ -906,18 +906,18 @@
         </w:tc>
         <w:tc>
           <w:tcPr>
-            <w:tcW w:type="dxa" w:w="1458"/>
-            <w:tcBorders>
-              <w:top w:val="single" w:color="000000" w:sz="4"/>
-              <w:left w:val="single" w:color="000000" w:sz="4"/>
-              <w:bottom w:val="single" w:color="000000" w:sz="4"/>
-              <w:right w:val="single" w:color="000000" w:sz="4"/>
-            </w:tcBorders>
-            <w:tcMar>
-              <w:top w:type="dxa" w:w="80"/>
-              <w:left w:type="dxa" w:w="100"/>
-              <w:bottom w:type="dxa" w:w="80"/>
-              <w:right w:type="dxa" w:w="150"/>
+            <w:tcW w:type="dxa" w:w="2036"/>
+            <w:tcBorders>
+              <w:top w:val="none" w:color="auto" w:sz="0"/>
+              <w:left w:val="none" w:color="auto" w:sz="0"/>
+              <w:bottom w:val="none" w:color="auto" w:sz="0"/>
+              <w:right w:val="none" w:color="auto" w:sz="0"/>
+            </w:tcBorders>
+            <w:tcMar>
+              <w:top w:type="dxa" w:w="20"/>
+              <w:left w:type="dxa" w:w="0"/>
+              <w:bottom w:type="dxa" w:w="20"/>
+              <w:right w:type="dxa" w:w="0"/>
             </w:tcMar>
             <w:vAlign w:val="center"/>
           </w:tcPr>
@@ -945,24 +945,24 @@
       <w:tr>
         <w:tc>
           <w:tcPr>
-            <w:tcW w:type="dxa" w:w="1675"/>
-            <w:tcBorders>
-              <w:top w:val="single" w:color="000000" w:sz="4"/>
-              <w:left w:val="single" w:color="000000" w:sz="4"/>
-              <w:bottom w:val="single" w:color="000000" w:sz="4"/>
-              <w:right w:val="single" w:color="000000" w:sz="4"/>
-            </w:tcBorders>
-            <w:tcMar>
-              <w:top w:type="dxa" w:w="80"/>
-              <w:left w:type="dxa" w:w="100"/>
-              <w:bottom w:type="dxa" w:w="80"/>
-              <w:right w:type="dxa" w:w="150"/>
-            </w:tcMar>
-            <w:vAlign w:val="center"/>
-          </w:tcPr>
-          <w:p>
-            <w:pPr>
-              <w:spacing w:after="0" w:before="60"/>
+            <w:tcW w:type="dxa" w:w="1500"/>
+            <w:tcBorders>
+              <w:top w:val="none" w:color="auto" w:sz="0"/>
+              <w:left w:val="none" w:color="auto" w:sz="0"/>
+              <w:bottom w:val="none" w:color="auto" w:sz="0"/>
+              <w:right w:val="none" w:color="auto" w:sz="0"/>
+            </w:tcBorders>
+            <w:tcMar>
+              <w:top w:type="dxa" w:w="20"/>
+              <w:left w:type="dxa" w:w="0"/>
+              <w:bottom w:type="dxa" w:w="20"/>
+              <w:right w:type="dxa" w:w="60"/>
+            </w:tcMar>
+            <w:vAlign w:val="center"/>
+          </w:tcPr>
+          <w:p>
+            <w:pPr>
+              <w:spacing w:after="0" w:before="40"/>
               <w:jc w:val="left"/>
             </w:pPr>
             <w:r>
@@ -1001,19 +1001,19 @@
         </w:tc>
         <w:tc>
           <w:tcPr>
-            <w:tcW w:type="dxa" w:w="7397"/>
+            <w:tcW w:type="dxa" w:w="7572"/>
             <w:gridSpan w:val="3"/>
             <w:tcBorders>
-              <w:top w:val="single" w:color="000000" w:sz="4"/>
-              <w:left w:val="single" w:color="000000" w:sz="4"/>
-              <w:bottom w:val="single" w:color="000000" w:sz="4"/>
-              <w:right w:val="single" w:color="000000" w:sz="4"/>
-            </w:tcBorders>
-            <w:tcMar>
-              <w:top w:type="dxa" w:w="80"/>
-              <w:left w:type="dxa" w:w="100"/>
-              <w:bottom w:type="dxa" w:w="80"/>
-              <w:right w:type="dxa" w:w="150"/>
+              <w:top w:val="none" w:color="auto" w:sz="0"/>
+              <w:left w:val="none" w:color="auto" w:sz="0"/>
+              <w:bottom w:val="none" w:color="auto" w:sz="0"/>
+              <w:right w:val="none" w:color="auto" w:sz="0"/>
+            </w:tcBorders>
+            <w:tcMar>
+              <w:top w:type="dxa" w:w="20"/>
+              <w:left w:type="dxa" w:w="0"/>
+              <w:bottom w:type="dxa" w:w="20"/>
+              <w:right w:type="dxa" w:w="0"/>
             </w:tcMar>
             <w:vAlign w:val="center"/>
           </w:tcPr>
@@ -1041,24 +1041,24 @@
       <w:tr>
         <w:tc>
           <w:tcPr>
-            <w:tcW w:type="dxa" w:w="1675"/>
-            <w:tcBorders>
-              <w:top w:val="single" w:color="000000" w:sz="4"/>
-              <w:left w:val="single" w:color="000000" w:sz="4"/>
-              <w:bottom w:val="single" w:color="000000" w:sz="4"/>
-              <w:right w:val="single" w:color="000000" w:sz="4"/>
-            </w:tcBorders>
-            <w:tcMar>
-              <w:top w:type="dxa" w:w="80"/>
-              <w:left w:type="dxa" w:w="100"/>
-              <w:bottom w:type="dxa" w:w="80"/>
-              <w:right w:type="dxa" w:w="150"/>
-            </w:tcMar>
-            <w:vAlign w:val="center"/>
-          </w:tcPr>
-          <w:p>
-            <w:pPr>
-              <w:spacing w:after="0" w:before="60"/>
+            <w:tcW w:type="dxa" w:w="1500"/>
+            <w:tcBorders>
+              <w:top w:val="none" w:color="auto" w:sz="0"/>
+              <w:left w:val="none" w:color="auto" w:sz="0"/>
+              <w:bottom w:val="none" w:color="auto" w:sz="0"/>
+              <w:right w:val="none" w:color="auto" w:sz="0"/>
+            </w:tcBorders>
+            <w:tcMar>
+              <w:top w:type="dxa" w:w="20"/>
+              <w:left w:type="dxa" w:w="0"/>
+              <w:bottom w:type="dxa" w:w="20"/>
+              <w:right w:type="dxa" w:w="60"/>
+            </w:tcMar>
+            <w:vAlign w:val="center"/>
+          </w:tcPr>
+          <w:p>
+            <w:pPr>
+              <w:spacing w:after="0" w:before="40"/>
               <w:jc w:val="left"/>
             </w:pPr>
             <w:r>
@@ -1097,19 +1097,19 @@
         </w:tc>
         <w:tc>
           <w:tcPr>
-            <w:tcW w:type="dxa" w:w="7397"/>
+            <w:tcW w:type="dxa" w:w="7572"/>
             <w:gridSpan w:val="3"/>
             <w:tcBorders>
-              <w:top w:val="single" w:color="000000" w:sz="4"/>
-              <w:left w:val="single" w:color="000000" w:sz="4"/>
-              <w:bottom w:val="single" w:color="000000" w:sz="4"/>
-              <w:right w:val="single" w:color="000000" w:sz="4"/>
-            </w:tcBorders>
-            <w:tcMar>
-              <w:top w:type="dxa" w:w="80"/>
-              <w:left w:type="dxa" w:w="100"/>
-              <w:bottom w:type="dxa" w:w="80"/>
-              <w:right w:type="dxa" w:w="150"/>
+              <w:top w:val="none" w:color="auto" w:sz="0"/>
+              <w:left w:val="none" w:color="auto" w:sz="0"/>
+              <w:bottom w:val="none" w:color="auto" w:sz="0"/>
+              <w:right w:val="none" w:color="auto" w:sz="0"/>
+            </w:tcBorders>
+            <w:tcMar>
+              <w:top w:type="dxa" w:w="20"/>
+              <w:left w:type="dxa" w:w="0"/>
+              <w:bottom w:type="dxa" w:w="20"/>
+              <w:right w:type="dxa" w:w="0"/>
             </w:tcMar>
             <w:vAlign w:val="center"/>
           </w:tcPr>
@@ -1137,7 +1137,7 @@
     </w:tbl>
     <w:p>
       <w:pPr>
-        <w:spacing w:after="80" w:before="80"/>
+        <w:spacing w:after="10" w:before="40"/>
         <w:jc w:val="left"/>
       </w:pPr>
       <w:r>
@@ -1153,6 +1153,14 @@
         </w:rPr>
         <w:t xml:space="preserve"/>
       </w:r>
+    </w:p>
+    <w:p>
+      <w:pPr>
+        <w:pBdr>
+          <w:bottom w:val="single" w:color="000000" w:sz="4"/>
+        </w:pBdr>
+        <w:spacing w:after="60" w:before="0"/>
+      </w:pPr>
     </w:p>
     <w:tbl>
       <w:tblPr>
@@ -1176,18 +1184,18 @@
       <w:tr>
         <w:tc>
           <w:tcPr>
-            <w:tcW w:type="dxa" w:w="1675"/>
-            <w:tcBorders>
-              <w:top w:val="single" w:color="000000" w:sz="4"/>
-              <w:left w:val="single" w:color="000000" w:sz="4"/>
-              <w:bottom w:val="single" w:color="000000" w:sz="4"/>
-              <w:right w:val="single" w:color="000000" w:sz="4"/>
-            </w:tcBorders>
-            <w:tcMar>
-              <w:top w:type="dxa" w:w="80"/>
+            <w:tcW w:type="dxa" w:w="1500"/>
+            <w:tcBorders>
+              <w:top w:val="single" w:color="767171" w:sz="2"/>
+              <w:left w:val="single" w:color="767171" w:sz="2"/>
+              <w:bottom w:val="single" w:color="767171" w:sz="2"/>
+              <w:right w:val="single" w:color="767171" w:sz="2"/>
+            </w:tcBorders>
+            <w:tcMar>
+              <w:top w:type="dxa" w:w="60"/>
               <w:left w:type="dxa" w:w="100"/>
-              <w:bottom w:type="dxa" w:w="80"/>
-              <w:right w:type="dxa" w:w="150"/>
+              <w:bottom w:type="dxa" w:w="60"/>
+              <w:right w:type="dxa" w:w="120"/>
             </w:tcMar>
             <w:vAlign w:val="center"/>
           </w:tcPr>
@@ -1232,18 +1240,18 @@
         </w:tc>
         <w:tc>
           <w:tcPr>
-            <w:tcW w:type="dxa" w:w="3426"/>
-            <w:tcBorders>
-              <w:top w:val="single" w:color="000000" w:sz="4"/>
-              <w:left w:val="single" w:color="000000" w:sz="4"/>
-              <w:bottom w:val="single" w:color="000000" w:sz="4"/>
-              <w:right w:val="single" w:color="000000" w:sz="4"/>
-            </w:tcBorders>
-            <w:tcMar>
-              <w:top w:type="dxa" w:w="80"/>
+            <w:tcW w:type="dxa" w:w="3036"/>
+            <w:tcBorders>
+              <w:top w:val="single" w:color="767171" w:sz="2"/>
+              <w:left w:val="single" w:color="767171" w:sz="2"/>
+              <w:bottom w:val="single" w:color="767171" w:sz="2"/>
+              <w:right w:val="single" w:color="767171" w:sz="2"/>
+            </w:tcBorders>
+            <w:tcMar>
+              <w:top w:type="dxa" w:w="60"/>
               <w:left w:type="dxa" w:w="100"/>
-              <w:bottom w:type="dxa" w:w="80"/>
-              <w:right w:type="dxa" w:w="150"/>
+              <w:bottom w:type="dxa" w:w="60"/>
+              <w:right w:type="dxa" w:w="120"/>
             </w:tcMar>
             <w:vAlign w:val="center"/>
           </w:tcPr>
@@ -1269,18 +1277,18 @@
         </w:tc>
         <w:tc>
           <w:tcPr>
-            <w:tcW w:type="dxa" w:w="2513"/>
-            <w:tcBorders>
-              <w:top w:val="single" w:color="000000" w:sz="4"/>
-              <w:left w:val="single" w:color="000000" w:sz="4"/>
-              <w:bottom w:val="single" w:color="000000" w:sz="4"/>
-              <w:right w:val="single" w:color="000000" w:sz="4"/>
-            </w:tcBorders>
-            <w:tcMar>
-              <w:top w:type="dxa" w:w="80"/>
+            <w:tcW w:type="dxa" w:w="2500"/>
+            <w:tcBorders>
+              <w:top w:val="single" w:color="767171" w:sz="2"/>
+              <w:left w:val="single" w:color="767171" w:sz="2"/>
+              <w:bottom w:val="single" w:color="767171" w:sz="2"/>
+              <w:right w:val="single" w:color="767171" w:sz="2"/>
+            </w:tcBorders>
+            <w:tcMar>
+              <w:top w:type="dxa" w:w="60"/>
               <w:left w:type="dxa" w:w="100"/>
-              <w:bottom w:type="dxa" w:w="80"/>
-              <w:right w:type="dxa" w:w="150"/>
+              <w:bottom w:type="dxa" w:w="60"/>
+              <w:right w:type="dxa" w:w="120"/>
             </w:tcMar>
             <w:vAlign w:val="center"/>
           </w:tcPr>
@@ -1325,18 +1333,18 @@
         </w:tc>
         <w:tc>
           <w:tcPr>
-            <w:tcW w:type="dxa" w:w="1458"/>
-            <w:tcBorders>
-              <w:top w:val="single" w:color="000000" w:sz="4"/>
-              <w:left w:val="single" w:color="000000" w:sz="4"/>
-              <w:bottom w:val="single" w:color="000000" w:sz="4"/>
-              <w:right w:val="single" w:color="000000" w:sz="4"/>
-            </w:tcBorders>
-            <w:tcMar>
-              <w:top w:type="dxa" w:w="80"/>
+            <w:tcW w:type="dxa" w:w="2036"/>
+            <w:tcBorders>
+              <w:top w:val="single" w:color="767171" w:sz="2"/>
+              <w:left w:val="single" w:color="767171" w:sz="2"/>
+              <w:bottom w:val="single" w:color="767171" w:sz="2"/>
+              <w:right w:val="single" w:color="767171" w:sz="2"/>
+            </w:tcBorders>
+            <w:tcMar>
+              <w:top w:type="dxa" w:w="60"/>
               <w:left w:type="dxa" w:w="100"/>
-              <w:bottom w:type="dxa" w:w="80"/>
-              <w:right w:type="dxa" w:w="150"/>
+              <w:bottom w:type="dxa" w:w="60"/>
+              <w:right w:type="dxa" w:w="120"/>
             </w:tcMar>
             <w:vAlign w:val="center"/>
           </w:tcPr>
@@ -1364,18 +1372,18 @@
       <w:tr>
         <w:tc>
           <w:tcPr>
-            <w:tcW w:type="dxa" w:w="1675"/>
-            <w:tcBorders>
-              <w:top w:val="single" w:color="000000" w:sz="4"/>
-              <w:left w:val="single" w:color="000000" w:sz="4"/>
-              <w:bottom w:val="single" w:color="000000" w:sz="4"/>
-              <w:right w:val="single" w:color="000000" w:sz="4"/>
-            </w:tcBorders>
-            <w:tcMar>
-              <w:top w:type="dxa" w:w="80"/>
+            <w:tcW w:type="dxa" w:w="1500"/>
+            <w:tcBorders>
+              <w:top w:val="single" w:color="767171" w:sz="2"/>
+              <w:left w:val="single" w:color="767171" w:sz="2"/>
+              <w:bottom w:val="single" w:color="767171" w:sz="2"/>
+              <w:right w:val="single" w:color="767171" w:sz="2"/>
+            </w:tcBorders>
+            <w:tcMar>
+              <w:top w:type="dxa" w:w="60"/>
               <w:left w:type="dxa" w:w="100"/>
-              <w:bottom w:type="dxa" w:w="80"/>
-              <w:right w:type="dxa" w:w="150"/>
+              <w:bottom w:type="dxa" w:w="60"/>
+              <w:right w:type="dxa" w:w="120"/>
             </w:tcMar>
             <w:vAlign w:val="center"/>
           </w:tcPr>
@@ -1401,18 +1409,18 @@
         </w:tc>
         <w:tc>
           <w:tcPr>
-            <w:tcW w:type="dxa" w:w="3426"/>
-            <w:tcBorders>
-              <w:top w:val="single" w:color="000000" w:sz="4"/>
-              <w:left w:val="single" w:color="000000" w:sz="4"/>
-              <w:bottom w:val="single" w:color="000000" w:sz="4"/>
-              <w:right w:val="single" w:color="000000" w:sz="4"/>
-            </w:tcBorders>
-            <w:tcMar>
-              <w:top w:type="dxa" w:w="80"/>
+            <w:tcW w:type="dxa" w:w="3036"/>
+            <w:tcBorders>
+              <w:top w:val="single" w:color="767171" w:sz="2"/>
+              <w:left w:val="single" w:color="767171" w:sz="2"/>
+              <w:bottom w:val="single" w:color="767171" w:sz="2"/>
+              <w:right w:val="single" w:color="767171" w:sz="2"/>
+            </w:tcBorders>
+            <w:tcMar>
+              <w:top w:type="dxa" w:w="60"/>
               <w:left w:type="dxa" w:w="100"/>
-              <w:bottom w:type="dxa" w:w="80"/>
-              <w:right w:type="dxa" w:w="150"/>
+              <w:bottom w:type="dxa" w:w="60"/>
+              <w:right w:type="dxa" w:w="120"/>
             </w:tcMar>
             <w:vAlign w:val="center"/>
           </w:tcPr>
@@ -1438,18 +1446,18 @@
         </w:tc>
         <w:tc>
           <w:tcPr>
-            <w:tcW w:type="dxa" w:w="2513"/>
-            <w:tcBorders>
-              <w:top w:val="single" w:color="000000" w:sz="4"/>
-              <w:left w:val="single" w:color="000000" w:sz="4"/>
-              <w:bottom w:val="single" w:color="000000" w:sz="4"/>
-              <w:right w:val="single" w:color="000000" w:sz="4"/>
-            </w:tcBorders>
-            <w:tcMar>
-              <w:top w:type="dxa" w:w="80"/>
+            <w:tcW w:type="dxa" w:w="2500"/>
+            <w:tcBorders>
+              <w:top w:val="single" w:color="767171" w:sz="2"/>
+              <w:left w:val="single" w:color="767171" w:sz="2"/>
+              <w:bottom w:val="single" w:color="767171" w:sz="2"/>
+              <w:right w:val="single" w:color="767171" w:sz="2"/>
+            </w:tcBorders>
+            <w:tcMar>
+              <w:top w:type="dxa" w:w="60"/>
               <w:left w:type="dxa" w:w="100"/>
-              <w:bottom w:type="dxa" w:w="80"/>
-              <w:right w:type="dxa" w:w="150"/>
+              <w:bottom w:type="dxa" w:w="60"/>
+              <w:right w:type="dxa" w:w="120"/>
             </w:tcMar>
             <w:vAlign w:val="center"/>
           </w:tcPr>
@@ -1475,18 +1483,18 @@
         </w:tc>
         <w:tc>
           <w:tcPr>
-            <w:tcW w:type="dxa" w:w="1458"/>
-            <w:tcBorders>
-              <w:top w:val="single" w:color="000000" w:sz="4"/>
-              <w:left w:val="single" w:color="000000" w:sz="4"/>
-              <w:bottom w:val="single" w:color="000000" w:sz="4"/>
-              <w:right w:val="single" w:color="000000" w:sz="4"/>
-            </w:tcBorders>
-            <w:tcMar>
-              <w:top w:type="dxa" w:w="80"/>
+            <w:tcW w:type="dxa" w:w="2036"/>
+            <w:tcBorders>
+              <w:top w:val="single" w:color="767171" w:sz="2"/>
+              <w:left w:val="single" w:color="767171" w:sz="2"/>
+              <w:bottom w:val="single" w:color="767171" w:sz="2"/>
+              <w:right w:val="single" w:color="767171" w:sz="2"/>
+            </w:tcBorders>
+            <w:tcMar>
+              <w:top w:type="dxa" w:w="60"/>
               <w:left w:type="dxa" w:w="100"/>
-              <w:bottom w:type="dxa" w:w="80"/>
-              <w:right w:type="dxa" w:w="150"/>
+              <w:bottom w:type="dxa" w:w="60"/>
+              <w:right w:type="dxa" w:w="120"/>
             </w:tcMar>
             <w:vAlign w:val="center"/>
           </w:tcPr>
@@ -1514,18 +1522,18 @@
       <w:tr>
         <w:tc>
           <w:tcPr>
-            <w:tcW w:type="dxa" w:w="1675"/>
-            <w:tcBorders>
-              <w:top w:val="single" w:color="000000" w:sz="4"/>
-              <w:left w:val="single" w:color="000000" w:sz="4"/>
-              <w:bottom w:val="single" w:color="000000" w:sz="4"/>
-              <w:right w:val="single" w:color="000000" w:sz="4"/>
-            </w:tcBorders>
-            <w:tcMar>
-              <w:top w:type="dxa" w:w="80"/>
+            <w:tcW w:type="dxa" w:w="1500"/>
+            <w:tcBorders>
+              <w:top w:val="single" w:color="767171" w:sz="2"/>
+              <w:left w:val="single" w:color="767171" w:sz="2"/>
+              <w:bottom w:val="single" w:color="767171" w:sz="2"/>
+              <w:right w:val="single" w:color="767171" w:sz="2"/>
+            </w:tcBorders>
+            <w:tcMar>
+              <w:top w:type="dxa" w:w="60"/>
               <w:left w:type="dxa" w:w="100"/>
-              <w:bottom w:type="dxa" w:w="80"/>
-              <w:right w:type="dxa" w:w="150"/>
+              <w:bottom w:type="dxa" w:w="60"/>
+              <w:right w:type="dxa" w:w="120"/>
             </w:tcMar>
             <w:vAlign w:val="center"/>
           </w:tcPr>
@@ -1570,19 +1578,19 @@
         </w:tc>
         <w:tc>
           <w:tcPr>
-            <w:tcW w:type="dxa" w:w="7397"/>
+            <w:tcW w:type="dxa" w:w="7572"/>
             <w:gridSpan w:val="3"/>
             <w:tcBorders>
-              <w:top w:val="single" w:color="000000" w:sz="4"/>
-              <w:left w:val="single" w:color="000000" w:sz="4"/>
-              <w:bottom w:val="single" w:color="000000" w:sz="4"/>
-              <w:right w:val="single" w:color="000000" w:sz="4"/>
-            </w:tcBorders>
-            <w:tcMar>
-              <w:top w:type="dxa" w:w="80"/>
+              <w:top w:val="single" w:color="767171" w:sz="2"/>
+              <w:left w:val="single" w:color="767171" w:sz="2"/>
+              <w:bottom w:val="single" w:color="767171" w:sz="2"/>
+              <w:right w:val="single" w:color="767171" w:sz="2"/>
+            </w:tcBorders>
+            <w:tcMar>
+              <w:top w:type="dxa" w:w="60"/>
               <w:left w:type="dxa" w:w="100"/>
-              <w:bottom w:type="dxa" w:w="80"/>
-              <w:right w:type="dxa" w:w="150"/>
+              <w:bottom w:type="dxa" w:w="60"/>
+              <w:right w:type="dxa" w:w="120"/>
             </w:tcMar>
             <w:vAlign w:val="center"/>
           </w:tcPr>
@@ -1629,18 +1637,18 @@
       <w:tr>
         <w:tc>
           <w:tcPr>
-            <w:tcW w:type="dxa" w:w="1675"/>
-            <w:tcBorders>
-              <w:top w:val="single" w:color="000000" w:sz="4"/>
-              <w:left w:val="single" w:color="000000" w:sz="4"/>
-              <w:bottom w:val="single" w:color="000000" w:sz="4"/>
-              <w:right w:val="single" w:color="000000" w:sz="4"/>
-            </w:tcBorders>
-            <w:tcMar>
-              <w:top w:type="dxa" w:w="80"/>
+            <w:tcW w:type="dxa" w:w="1500"/>
+            <w:tcBorders>
+              <w:top w:val="single" w:color="767171" w:sz="2"/>
+              <w:left w:val="single" w:color="767171" w:sz="2"/>
+              <w:bottom w:val="single" w:color="767171" w:sz="2"/>
+              <w:right w:val="single" w:color="767171" w:sz="2"/>
+            </w:tcBorders>
+            <w:tcMar>
+              <w:top w:type="dxa" w:w="60"/>
               <w:left w:type="dxa" w:w="100"/>
-              <w:bottom w:type="dxa" w:w="80"/>
-              <w:right w:type="dxa" w:w="150"/>
+              <w:bottom w:type="dxa" w:w="60"/>
+              <w:right w:type="dxa" w:w="120"/>
             </w:tcMar>
             <w:vAlign w:val="center"/>
           </w:tcPr>
@@ -1685,18 +1693,18 @@
         </w:tc>
         <w:tc>
           <w:tcPr>
-            <w:tcW w:type="dxa" w:w="3426"/>
-            <w:tcBorders>
-              <w:top w:val="single" w:color="000000" w:sz="4"/>
-              <w:left w:val="single" w:color="000000" w:sz="4"/>
-              <w:bottom w:val="single" w:color="000000" w:sz="4"/>
-              <w:right w:val="single" w:color="000000" w:sz="4"/>
-            </w:tcBorders>
-            <w:tcMar>
-              <w:top w:type="dxa" w:w="80"/>
+            <w:tcW w:type="dxa" w:w="3036"/>
+            <w:tcBorders>
+              <w:top w:val="single" w:color="767171" w:sz="2"/>
+              <w:left w:val="single" w:color="767171" w:sz="2"/>
+              <w:bottom w:val="single" w:color="767171" w:sz="2"/>
+              <w:right w:val="single" w:color="767171" w:sz="2"/>
+            </w:tcBorders>
+            <w:tcMar>
+              <w:top w:type="dxa" w:w="60"/>
               <w:left w:type="dxa" w:w="100"/>
-              <w:bottom w:type="dxa" w:w="80"/>
-              <w:right w:type="dxa" w:w="150"/>
+              <w:bottom w:type="dxa" w:w="60"/>
+              <w:right w:type="dxa" w:w="120"/>
             </w:tcMar>
             <w:vAlign w:val="center"/>
           </w:tcPr>
@@ -1741,18 +1749,18 @@
         </w:tc>
         <w:tc>
           <w:tcPr>
-            <w:tcW w:type="dxa" w:w="2513"/>
-            <w:tcBorders>
-              <w:top w:val="single" w:color="000000" w:sz="4"/>
-              <w:left w:val="single" w:color="000000" w:sz="4"/>
-              <w:bottom w:val="single" w:color="000000" w:sz="4"/>
-              <w:right w:val="single" w:color="000000" w:sz="4"/>
-            </w:tcBorders>
-            <w:tcMar>
-              <w:top w:type="dxa" w:w="80"/>
+            <w:tcW w:type="dxa" w:w="2500"/>
+            <w:tcBorders>
+              <w:top w:val="single" w:color="767171" w:sz="2"/>
+              <w:left w:val="single" w:color="767171" w:sz="2"/>
+              <w:bottom w:val="single" w:color="767171" w:sz="2"/>
+              <w:right w:val="single" w:color="767171" w:sz="2"/>
+            </w:tcBorders>
+            <w:tcMar>
+              <w:top w:type="dxa" w:w="60"/>
               <w:left w:type="dxa" w:w="100"/>
-              <w:bottom w:type="dxa" w:w="80"/>
-              <w:right w:type="dxa" w:w="150"/>
+              <w:bottom w:type="dxa" w:w="60"/>
+              <w:right w:type="dxa" w:w="120"/>
             </w:tcMar>
             <w:vAlign w:val="center"/>
           </w:tcPr>
@@ -1778,18 +1786,18 @@
         </w:tc>
         <w:tc>
           <w:tcPr>
-            <w:tcW w:type="dxa" w:w="1458"/>
-            <w:tcBorders>
-              <w:top w:val="single" w:color="000000" w:sz="4"/>
-              <w:left w:val="single" w:color="000000" w:sz="4"/>
-              <w:bottom w:val="single" w:color="000000" w:sz="4"/>
-              <w:right w:val="single" w:color="000000" w:sz="4"/>
-            </w:tcBorders>
-            <w:tcMar>
-              <w:top w:type="dxa" w:w="80"/>
+            <w:tcW w:type="dxa" w:w="2036"/>
+            <w:tcBorders>
+              <w:top w:val="single" w:color="767171" w:sz="2"/>
+              <w:left w:val="single" w:color="767171" w:sz="2"/>
+              <w:bottom w:val="single" w:color="767171" w:sz="2"/>
+              <w:right w:val="single" w:color="767171" w:sz="2"/>
+            </w:tcBorders>
+            <w:tcMar>
+              <w:top w:type="dxa" w:w="60"/>
               <w:left w:type="dxa" w:w="100"/>
-              <w:bottom w:type="dxa" w:w="80"/>
-              <w:right w:type="dxa" w:w="150"/>
+              <w:bottom w:type="dxa" w:w="60"/>
+              <w:right w:type="dxa" w:w="120"/>
             </w:tcMar>
             <w:vAlign w:val="center"/>
           </w:tcPr>
@@ -1836,18 +1844,18 @@
       <w:tr>
         <w:tc>
           <w:tcPr>
-            <w:tcW w:type="dxa" w:w="1675"/>
-            <w:tcBorders>
-              <w:top w:val="single" w:color="000000" w:sz="4"/>
-              <w:left w:val="single" w:color="000000" w:sz="4"/>
-              <w:bottom w:val="single" w:color="000000" w:sz="4"/>
-              <w:right w:val="single" w:color="000000" w:sz="4"/>
-            </w:tcBorders>
-            <w:tcMar>
-              <w:top w:type="dxa" w:w="80"/>
+            <w:tcW w:type="dxa" w:w="1500"/>
+            <w:tcBorders>
+              <w:top w:val="single" w:color="767171" w:sz="2"/>
+              <w:left w:val="single" w:color="767171" w:sz="2"/>
+              <w:bottom w:val="single" w:color="767171" w:sz="2"/>
+              <w:right w:val="single" w:color="767171" w:sz="2"/>
+            </w:tcBorders>
+            <w:tcMar>
+              <w:top w:type="dxa" w:w="60"/>
               <w:left w:type="dxa" w:w="100"/>
-              <w:bottom w:type="dxa" w:w="80"/>
-              <w:right w:type="dxa" w:w="150"/>
+              <w:bottom w:type="dxa" w:w="60"/>
+              <w:right w:type="dxa" w:w="120"/>
             </w:tcMar>
             <w:vAlign w:val="center"/>
           </w:tcPr>
@@ -1873,18 +1881,18 @@
         </w:tc>
         <w:tc>
           <w:tcPr>
-            <w:tcW w:type="dxa" w:w="3426"/>
-            <w:tcBorders>
-              <w:top w:val="single" w:color="000000" w:sz="4"/>
-              <w:left w:val="single" w:color="000000" w:sz="4"/>
-              <w:bottom w:val="single" w:color="000000" w:sz="4"/>
-              <w:right w:val="single" w:color="000000" w:sz="4"/>
-            </w:tcBorders>
-            <w:tcMar>
-              <w:top w:type="dxa" w:w="80"/>
+            <w:tcW w:type="dxa" w:w="3036"/>
+            <w:tcBorders>
+              <w:top w:val="single" w:color="767171" w:sz="2"/>
+              <w:left w:val="single" w:color="767171" w:sz="2"/>
+              <w:bottom w:val="single" w:color="767171" w:sz="2"/>
+              <w:right w:val="single" w:color="767171" w:sz="2"/>
+            </w:tcBorders>
+            <w:tcMar>
+              <w:top w:type="dxa" w:w="60"/>
               <w:left w:type="dxa" w:w="100"/>
-              <w:bottom w:type="dxa" w:w="80"/>
-              <w:right w:type="dxa" w:w="150"/>
+              <w:bottom w:type="dxa" w:w="60"/>
+              <w:right w:type="dxa" w:w="120"/>
             </w:tcMar>
             <w:vAlign w:val="center"/>
           </w:tcPr>
@@ -1910,18 +1918,18 @@
         </w:tc>
         <w:tc>
           <w:tcPr>
-            <w:tcW w:type="dxa" w:w="2513"/>
-            <w:tcBorders>
-              <w:top w:val="single" w:color="000000" w:sz="4"/>
-              <w:left w:val="single" w:color="000000" w:sz="4"/>
-              <w:bottom w:val="single" w:color="000000" w:sz="4"/>
-              <w:right w:val="single" w:color="000000" w:sz="4"/>
-            </w:tcBorders>
-            <w:tcMar>
-              <w:top w:type="dxa" w:w="80"/>
+            <w:tcW w:type="dxa" w:w="2500"/>
+            <w:tcBorders>
+              <w:top w:val="single" w:color="767171" w:sz="2"/>
+              <w:left w:val="single" w:color="767171" w:sz="2"/>
+              <w:bottom w:val="single" w:color="767171" w:sz="2"/>
+              <w:right w:val="single" w:color="767171" w:sz="2"/>
+            </w:tcBorders>
+            <w:tcMar>
+              <w:top w:type="dxa" w:w="60"/>
               <w:left w:type="dxa" w:w="100"/>
-              <w:bottom w:type="dxa" w:w="80"/>
-              <w:right w:type="dxa" w:w="150"/>
+              <w:bottom w:type="dxa" w:w="60"/>
+              <w:right w:type="dxa" w:w="120"/>
             </w:tcMar>
             <w:vAlign w:val="center"/>
           </w:tcPr>
@@ -1947,18 +1955,18 @@
         </w:tc>
         <w:tc>
           <w:tcPr>
-            <w:tcW w:type="dxa" w:w="1458"/>
-            <w:tcBorders>
-              <w:top w:val="single" w:color="000000" w:sz="4"/>
-              <w:left w:val="single" w:color="000000" w:sz="4"/>
-              <w:bottom w:val="single" w:color="000000" w:sz="4"/>
-              <w:right w:val="single" w:color="000000" w:sz="4"/>
-            </w:tcBorders>
-            <w:tcMar>
-              <w:top w:type="dxa" w:w="80"/>
+            <w:tcW w:type="dxa" w:w="2036"/>
+            <w:tcBorders>
+              <w:top w:val="single" w:color="767171" w:sz="2"/>
+              <w:left w:val="single" w:color="767171" w:sz="2"/>
+              <w:bottom w:val="single" w:color="767171" w:sz="2"/>
+              <w:right w:val="single" w:color="767171" w:sz="2"/>
+            </w:tcBorders>
+            <w:tcMar>
+              <w:top w:type="dxa" w:w="60"/>
               <w:left w:type="dxa" w:w="100"/>
-              <w:bottom w:type="dxa" w:w="80"/>
-              <w:right w:type="dxa" w:w="150"/>
+              <w:bottom w:type="dxa" w:w="60"/>
+              <w:right w:type="dxa" w:w="120"/>
             </w:tcMar>
             <w:vAlign w:val="center"/>
           </w:tcPr>
@@ -2343,17 +2351,17 @@
           <w:tcPr>
             <w:tcW w:type="dxa" w:w="1500"/>
             <w:tcBorders>
-              <w:top w:val="single" w:color="000000" w:sz="4"/>
-              <w:left w:val="single" w:color="000000" w:sz="4"/>
-              <w:bottom w:val="single" w:color="000000" w:sz="4"/>
-              <w:right w:val="single" w:color="000000" w:sz="4"/>
-            </w:tcBorders>
-            <w:shd w:fill="F2F2F2"/>
-            <w:tcMar>
-              <w:top w:type="dxa" w:w="80"/>
-              <w:left w:type="dxa" w:w="100"/>
-              <w:bottom w:type="dxa" w:w="80"/>
-              <w:right w:type="dxa" w:w="150"/>
+              <w:top w:val="single" w:color="767171" w:sz="2"/>
+              <w:left w:val="single" w:color="767171" w:sz="2"/>
+              <w:bottom w:val="single" w:color="767171" w:sz="2"/>
+              <w:right w:val="single" w:color="767171" w:sz="2"/>
+            </w:tcBorders>
+            <w:shd w:fill="008080"/>
+            <w:tcMar>
+              <w:top w:type="dxa" w:w="60"/>
+              <w:left w:type="dxa" w:w="80"/>
+              <w:bottom w:type="dxa" w:w="60"/>
+              <w:right w:type="dxa" w:w="120"/>
             </w:tcMar>
             <w:vAlign w:val="center"/>
           </w:tcPr>
@@ -2369,7 +2377,7 @@
                 <w:bCs/>
                 <w:i w:val="false"/>
                 <w:iCs w:val="false"/>
-                <w:color w:val="1a1a1a"/>
+                <w:color w:val="ffffff"/>
                 <w:sz w:val="18"/>
                 <w:szCs w:val="18"/>
               </w:rPr>
@@ -2388,7 +2396,7 @@
                 <w:bCs/>
                 <w:i/>
                 <w:iCs/>
-                <w:color w:val="1a1a1a"/>
+                <w:color w:val="ffffff"/>
                 <w:sz w:val="18"/>
                 <w:szCs w:val="18"/>
               </w:rPr>
@@ -2400,17 +2408,17 @@
           <w:tcPr>
             <w:tcW w:type="dxa" w:w="1500"/>
             <w:tcBorders>
-              <w:top w:val="single" w:color="000000" w:sz="4"/>
-              <w:left w:val="single" w:color="000000" w:sz="4"/>
-              <w:bottom w:val="single" w:color="000000" w:sz="4"/>
-              <w:right w:val="single" w:color="000000" w:sz="4"/>
-            </w:tcBorders>
-            <w:shd w:fill="F2F2F2"/>
-            <w:tcMar>
-              <w:top w:type="dxa" w:w="80"/>
-              <w:left w:type="dxa" w:w="100"/>
-              <w:bottom w:type="dxa" w:w="80"/>
-              <w:right w:type="dxa" w:w="150"/>
+              <w:top w:val="single" w:color="767171" w:sz="2"/>
+              <w:left w:val="single" w:color="767171" w:sz="2"/>
+              <w:bottom w:val="single" w:color="767171" w:sz="2"/>
+              <w:right w:val="single" w:color="767171" w:sz="2"/>
+            </w:tcBorders>
+            <w:shd w:fill="008080"/>
+            <w:tcMar>
+              <w:top w:type="dxa" w:w="60"/>
+              <w:left w:type="dxa" w:w="80"/>
+              <w:bottom w:type="dxa" w:w="60"/>
+              <w:right w:type="dxa" w:w="120"/>
             </w:tcMar>
             <w:vAlign w:val="center"/>
           </w:tcPr>
@@ -2426,7 +2434,7 @@
                 <w:bCs/>
                 <w:i w:val="false"/>
                 <w:iCs w:val="false"/>
-                <w:color w:val="1a1a1a"/>
+                <w:color w:val="ffffff"/>
                 <w:sz w:val="18"/>
                 <w:szCs w:val="18"/>
               </w:rPr>
@@ -2445,7 +2453,7 @@
                 <w:bCs/>
                 <w:i/>
                 <w:iCs/>
-                <w:color w:val="1a1a1a"/>
+                <w:color w:val="ffffff"/>
                 <w:sz w:val="18"/>
                 <w:szCs w:val="18"/>
               </w:rPr>
@@ -2457,17 +2465,17 @@
           <w:tcPr>
             <w:tcW w:type="dxa" w:w="1300"/>
             <w:tcBorders>
-              <w:top w:val="single" w:color="000000" w:sz="4"/>
-              <w:left w:val="single" w:color="000000" w:sz="4"/>
-              <w:bottom w:val="single" w:color="000000" w:sz="4"/>
-              <w:right w:val="single" w:color="000000" w:sz="4"/>
-            </w:tcBorders>
-            <w:shd w:fill="F2F2F2"/>
-            <w:tcMar>
-              <w:top w:type="dxa" w:w="80"/>
-              <w:left w:type="dxa" w:w="100"/>
-              <w:bottom w:type="dxa" w:w="80"/>
-              <w:right w:type="dxa" w:w="150"/>
+              <w:top w:val="single" w:color="767171" w:sz="2"/>
+              <w:left w:val="single" w:color="767171" w:sz="2"/>
+              <w:bottom w:val="single" w:color="767171" w:sz="2"/>
+              <w:right w:val="single" w:color="767171" w:sz="2"/>
+            </w:tcBorders>
+            <w:shd w:fill="008080"/>
+            <w:tcMar>
+              <w:top w:type="dxa" w:w="60"/>
+              <w:left w:type="dxa" w:w="80"/>
+              <w:bottom w:type="dxa" w:w="60"/>
+              <w:right w:type="dxa" w:w="120"/>
             </w:tcMar>
             <w:vAlign w:val="center"/>
           </w:tcPr>
@@ -2483,7 +2491,7 @@
                 <w:bCs/>
                 <w:i w:val="false"/>
                 <w:iCs w:val="false"/>
-                <w:color w:val="1a1a1a"/>
+                <w:color w:val="ffffff"/>
                 <w:sz w:val="18"/>
                 <w:szCs w:val="18"/>
               </w:rPr>
@@ -2502,7 +2510,7 @@
                 <w:bCs/>
                 <w:i/>
                 <w:iCs/>
-                <w:color w:val="1a1a1a"/>
+                <w:color w:val="ffffff"/>
                 <w:sz w:val="18"/>
                 <w:szCs w:val="18"/>
               </w:rPr>
@@ -2514,17 +2522,17 @@
           <w:tcPr>
             <w:tcW w:type="dxa" w:w="1200"/>
             <w:tcBorders>
-              <w:top w:val="single" w:color="000000" w:sz="4"/>
-              <w:left w:val="single" w:color="000000" w:sz="4"/>
-              <w:bottom w:val="single" w:color="000000" w:sz="4"/>
-              <w:right w:val="single" w:color="000000" w:sz="4"/>
-            </w:tcBorders>
-            <w:shd w:fill="F2F2F2"/>
-            <w:tcMar>
-              <w:top w:type="dxa" w:w="80"/>
-              <w:left w:type="dxa" w:w="100"/>
-              <w:bottom w:type="dxa" w:w="80"/>
-              <w:right w:type="dxa" w:w="150"/>
+              <w:top w:val="single" w:color="767171" w:sz="2"/>
+              <w:left w:val="single" w:color="767171" w:sz="2"/>
+              <w:bottom w:val="single" w:color="767171" w:sz="2"/>
+              <w:right w:val="single" w:color="767171" w:sz="2"/>
+            </w:tcBorders>
+            <w:shd w:fill="008080"/>
+            <w:tcMar>
+              <w:top w:type="dxa" w:w="60"/>
+              <w:left w:type="dxa" w:w="80"/>
+              <w:bottom w:type="dxa" w:w="60"/>
+              <w:right w:type="dxa" w:w="120"/>
             </w:tcMar>
             <w:vAlign w:val="center"/>
           </w:tcPr>
@@ -2540,7 +2548,7 @@
                 <w:bCs/>
                 <w:i w:val="false"/>
                 <w:iCs w:val="false"/>
-                <w:color w:val="1a1a1a"/>
+                <w:color w:val="ffffff"/>
                 <w:sz w:val="18"/>
                 <w:szCs w:val="18"/>
               </w:rPr>
@@ -2559,7 +2567,7 @@
                 <w:bCs/>
                 <w:i/>
                 <w:iCs/>
-                <w:color w:val="1a1a1a"/>
+                <w:color w:val="ffffff"/>
                 <w:sz w:val="18"/>
                 <w:szCs w:val="18"/>
               </w:rPr>
@@ -2571,17 +2579,17 @@
           <w:tcPr>
             <w:tcW w:type="dxa" w:w="1100"/>
             <w:tcBorders>
-              <w:top w:val="single" w:color="000000" w:sz="4"/>
-              <w:left w:val="single" w:color="000000" w:sz="4"/>
-              <w:bottom w:val="single" w:color="000000" w:sz="4"/>
-              <w:right w:val="single" w:color="000000" w:sz="4"/>
-            </w:tcBorders>
-            <w:shd w:fill="F2F2F2"/>
-            <w:tcMar>
-              <w:top w:type="dxa" w:w="80"/>
-              <w:left w:type="dxa" w:w="100"/>
-              <w:bottom w:type="dxa" w:w="80"/>
-              <w:right w:type="dxa" w:w="150"/>
+              <w:top w:val="single" w:color="767171" w:sz="2"/>
+              <w:left w:val="single" w:color="767171" w:sz="2"/>
+              <w:bottom w:val="single" w:color="767171" w:sz="2"/>
+              <w:right w:val="single" w:color="767171" w:sz="2"/>
+            </w:tcBorders>
+            <w:shd w:fill="008080"/>
+            <w:tcMar>
+              <w:top w:type="dxa" w:w="60"/>
+              <w:left w:type="dxa" w:w="80"/>
+              <w:bottom w:type="dxa" w:w="60"/>
+              <w:right w:type="dxa" w:w="120"/>
             </w:tcMar>
             <w:vAlign w:val="center"/>
           </w:tcPr>
@@ -2597,7 +2605,7 @@
                 <w:bCs/>
                 <w:i w:val="false"/>
                 <w:iCs w:val="false"/>
-                <w:color w:val="1a1a1a"/>
+                <w:color w:val="ffffff"/>
                 <w:sz w:val="18"/>
                 <w:szCs w:val="18"/>
               </w:rPr>
@@ -2616,7 +2624,7 @@
                 <w:bCs/>
                 <w:i/>
                 <w:iCs/>
-                <w:color w:val="1a1a1a"/>
+                <w:color w:val="ffffff"/>
                 <w:sz w:val="18"/>
                 <w:szCs w:val="18"/>
               </w:rPr>
@@ -2628,17 +2636,17 @@
           <w:tcPr>
             <w:tcW w:type="dxa" w:w="1100"/>
             <w:tcBorders>
-              <w:top w:val="single" w:color="000000" w:sz="4"/>
-              <w:left w:val="single" w:color="000000" w:sz="4"/>
-              <w:bottom w:val="single" w:color="000000" w:sz="4"/>
-              <w:right w:val="single" w:color="000000" w:sz="4"/>
-            </w:tcBorders>
-            <w:shd w:fill="F2F2F2"/>
-            <w:tcMar>
-              <w:top w:type="dxa" w:w="80"/>
-              <w:left w:type="dxa" w:w="100"/>
-              <w:bottom w:type="dxa" w:w="80"/>
-              <w:right w:type="dxa" w:w="150"/>
+              <w:top w:val="single" w:color="767171" w:sz="2"/>
+              <w:left w:val="single" w:color="767171" w:sz="2"/>
+              <w:bottom w:val="single" w:color="767171" w:sz="2"/>
+              <w:right w:val="single" w:color="767171" w:sz="2"/>
+            </w:tcBorders>
+            <w:shd w:fill="008080"/>
+            <w:tcMar>
+              <w:top w:type="dxa" w:w="60"/>
+              <w:left w:type="dxa" w:w="80"/>
+              <w:bottom w:type="dxa" w:w="60"/>
+              <w:right w:type="dxa" w:w="120"/>
             </w:tcMar>
             <w:vAlign w:val="center"/>
           </w:tcPr>
@@ -2654,7 +2662,7 @@
                 <w:bCs/>
                 <w:i w:val="false"/>
                 <w:iCs w:val="false"/>
-                <w:color w:val="1a1a1a"/>
+                <w:color w:val="ffffff"/>
                 <w:sz w:val="18"/>
                 <w:szCs w:val="18"/>
               </w:rPr>
@@ -2673,7 +2681,7 @@
                 <w:bCs/>
                 <w:i/>
                 <w:iCs/>
-                <w:color w:val="1a1a1a"/>
+                <w:color w:val="ffffff"/>
                 <w:sz w:val="18"/>
                 <w:szCs w:val="18"/>
               </w:rPr>
@@ -2685,17 +2693,17 @@
           <w:tcPr>
             <w:tcW w:type="dxa" w:w="1372"/>
             <w:tcBorders>
-              <w:top w:val="single" w:color="000000" w:sz="4"/>
-              <w:left w:val="single" w:color="000000" w:sz="4"/>
-              <w:bottom w:val="single" w:color="000000" w:sz="4"/>
-              <w:right w:val="single" w:color="000000" w:sz="4"/>
-            </w:tcBorders>
-            <w:shd w:fill="F2F2F2"/>
-            <w:tcMar>
-              <w:top w:type="dxa" w:w="80"/>
-              <w:left w:type="dxa" w:w="100"/>
-              <w:bottom w:type="dxa" w:w="80"/>
-              <w:right w:type="dxa" w:w="150"/>
+              <w:top w:val="single" w:color="767171" w:sz="2"/>
+              <w:left w:val="single" w:color="767171" w:sz="2"/>
+              <w:bottom w:val="single" w:color="767171" w:sz="2"/>
+              <w:right w:val="single" w:color="767171" w:sz="2"/>
+            </w:tcBorders>
+            <w:shd w:fill="008080"/>
+            <w:tcMar>
+              <w:top w:type="dxa" w:w="60"/>
+              <w:left w:type="dxa" w:w="80"/>
+              <w:bottom w:type="dxa" w:w="60"/>
+              <w:right w:type="dxa" w:w="120"/>
             </w:tcMar>
             <w:vAlign w:val="center"/>
           </w:tcPr>
@@ -2711,7 +2719,7 @@
                 <w:bCs/>
                 <w:i w:val="false"/>
                 <w:iCs w:val="false"/>
-                <w:color w:val="1a1a1a"/>
+                <w:color w:val="ffffff"/>
                 <w:sz w:val="18"/>
                 <w:szCs w:val="18"/>
               </w:rPr>
@@ -2730,7 +2738,7 @@
                 <w:bCs/>
                 <w:i/>
                 <w:iCs/>
-                <w:color w:val="1a1a1a"/>
+                <w:color w:val="ffffff"/>
                 <w:sz w:val="18"/>
                 <w:szCs w:val="18"/>
               </w:rPr>
@@ -2744,16 +2752,16 @@
           <w:tcPr>
             <w:tcW w:type="dxa" w:w="1500"/>
             <w:tcBorders>
-              <w:top w:val="single" w:color="000000" w:sz="4"/>
-              <w:left w:val="single" w:color="000000" w:sz="4"/>
-              <w:bottom w:val="single" w:color="000000" w:sz="4"/>
-              <w:right w:val="single" w:color="000000" w:sz="4"/>
-            </w:tcBorders>
-            <w:tcMar>
-              <w:top w:type="dxa" w:w="80"/>
+              <w:top w:val="single" w:color="767171" w:sz="2"/>
+              <w:left w:val="single" w:color="767171" w:sz="2"/>
+              <w:bottom w:val="single" w:color="767171" w:sz="2"/>
+              <w:right w:val="single" w:color="767171" w:sz="2"/>
+            </w:tcBorders>
+            <w:tcMar>
+              <w:top w:type="dxa" w:w="60"/>
               <w:left w:type="dxa" w:w="100"/>
-              <w:bottom w:type="dxa" w:w="80"/>
-              <w:right w:type="dxa" w:w="150"/>
+              <w:bottom w:type="dxa" w:w="60"/>
+              <w:right w:type="dxa" w:w="120"/>
             </w:tcMar>
             <w:vAlign w:val="center"/>
           </w:tcPr>
@@ -2781,16 +2789,16 @@
           <w:tcPr>
             <w:tcW w:type="dxa" w:w="1500"/>
             <w:tcBorders>
-              <w:top w:val="single" w:color="000000" w:sz="4"/>
-              <w:left w:val="single" w:color="000000" w:sz="4"/>
-              <w:bottom w:val="single" w:color="000000" w:sz="4"/>
-              <w:right w:val="single" w:color="000000" w:sz="4"/>
-            </w:tcBorders>
-            <w:tcMar>
-              <w:top w:type="dxa" w:w="80"/>
+              <w:top w:val="single" w:color="767171" w:sz="2"/>
+              <w:left w:val="single" w:color="767171" w:sz="2"/>
+              <w:bottom w:val="single" w:color="767171" w:sz="2"/>
+              <w:right w:val="single" w:color="767171" w:sz="2"/>
+            </w:tcBorders>
+            <w:tcMar>
+              <w:top w:type="dxa" w:w="60"/>
               <w:left w:type="dxa" w:w="100"/>
-              <w:bottom w:type="dxa" w:w="80"/>
-              <w:right w:type="dxa" w:w="150"/>
+              <w:bottom w:type="dxa" w:w="60"/>
+              <w:right w:type="dxa" w:w="120"/>
             </w:tcMar>
             <w:vAlign w:val="center"/>
           </w:tcPr>
@@ -2818,16 +2826,16 @@
           <w:tcPr>
             <w:tcW w:type="dxa" w:w="1300"/>
             <w:tcBorders>
-              <w:top w:val="single" w:color="000000" w:sz="4"/>
-              <w:left w:val="single" w:color="000000" w:sz="4"/>
-              <w:bottom w:val="single" w:color="000000" w:sz="4"/>
-              <w:right w:val="single" w:color="000000" w:sz="4"/>
-            </w:tcBorders>
-            <w:tcMar>
-              <w:top w:type="dxa" w:w="80"/>
+              <w:top w:val="single" w:color="767171" w:sz="2"/>
+              <w:left w:val="single" w:color="767171" w:sz="2"/>
+              <w:bottom w:val="single" w:color="767171" w:sz="2"/>
+              <w:right w:val="single" w:color="767171" w:sz="2"/>
+            </w:tcBorders>
+            <w:tcMar>
+              <w:top w:type="dxa" w:w="60"/>
               <w:left w:type="dxa" w:w="100"/>
-              <w:bottom w:type="dxa" w:w="80"/>
-              <w:right w:type="dxa" w:w="150"/>
+              <w:bottom w:type="dxa" w:w="60"/>
+              <w:right w:type="dxa" w:w="120"/>
             </w:tcMar>
             <w:vAlign w:val="center"/>
           </w:tcPr>
@@ -2855,16 +2863,16 @@
           <w:tcPr>
             <w:tcW w:type="dxa" w:w="1200"/>
             <w:tcBorders>
-              <w:top w:val="single" w:color="000000" w:sz="4"/>
-              <w:left w:val="single" w:color="000000" w:sz="4"/>
-              <w:bottom w:val="single" w:color="000000" w:sz="4"/>
-              <w:right w:val="single" w:color="000000" w:sz="4"/>
-            </w:tcBorders>
-            <w:tcMar>
-              <w:top w:type="dxa" w:w="80"/>
+              <w:top w:val="single" w:color="767171" w:sz="2"/>
+              <w:left w:val="single" w:color="767171" w:sz="2"/>
+              <w:bottom w:val="single" w:color="767171" w:sz="2"/>
+              <w:right w:val="single" w:color="767171" w:sz="2"/>
+            </w:tcBorders>
+            <w:tcMar>
+              <w:top w:type="dxa" w:w="60"/>
               <w:left w:type="dxa" w:w="100"/>
-              <w:bottom w:type="dxa" w:w="80"/>
-              <w:right w:type="dxa" w:w="150"/>
+              <w:bottom w:type="dxa" w:w="60"/>
+              <w:right w:type="dxa" w:w="120"/>
             </w:tcMar>
             <w:vAlign w:val="center"/>
           </w:tcPr>
@@ -2892,16 +2900,16 @@
           <w:tcPr>
             <w:tcW w:type="dxa" w:w="1100"/>
             <w:tcBorders>
-              <w:top w:val="single" w:color="000000" w:sz="4"/>
-              <w:left w:val="single" w:color="000000" w:sz="4"/>
-              <w:bottom w:val="single" w:color="000000" w:sz="4"/>
-              <w:right w:val="single" w:color="000000" w:sz="4"/>
-            </w:tcBorders>
-            <w:tcMar>
-              <w:top w:type="dxa" w:w="80"/>
+              <w:top w:val="single" w:color="767171" w:sz="2"/>
+              <w:left w:val="single" w:color="767171" w:sz="2"/>
+              <w:bottom w:val="single" w:color="767171" w:sz="2"/>
+              <w:right w:val="single" w:color="767171" w:sz="2"/>
+            </w:tcBorders>
+            <w:tcMar>
+              <w:top w:type="dxa" w:w="60"/>
               <w:left w:type="dxa" w:w="100"/>
-              <w:bottom w:type="dxa" w:w="80"/>
-              <w:right w:type="dxa" w:w="150"/>
+              <w:bottom w:type="dxa" w:w="60"/>
+              <w:right w:type="dxa" w:w="120"/>
             </w:tcMar>
             <w:vAlign w:val="center"/>
           </w:tcPr>
@@ -2929,16 +2937,16 @@
           <w:tcPr>
             <w:tcW w:type="dxa" w:w="1100"/>
             <w:tcBorders>
-              <w:top w:val="single" w:color="000000" w:sz="4"/>
-              <w:left w:val="single" w:color="000000" w:sz="4"/>
-              <w:bottom w:val="single" w:color="000000" w:sz="4"/>
-              <w:right w:val="single" w:color="000000" w:sz="4"/>
-            </w:tcBorders>
-            <w:tcMar>
-              <w:top w:type="dxa" w:w="80"/>
+              <w:top w:val="single" w:color="767171" w:sz="2"/>
+              <w:left w:val="single" w:color="767171" w:sz="2"/>
+              <w:bottom w:val="single" w:color="767171" w:sz="2"/>
+              <w:right w:val="single" w:color="767171" w:sz="2"/>
+            </w:tcBorders>
+            <w:tcMar>
+              <w:top w:type="dxa" w:w="60"/>
               <w:left w:type="dxa" w:w="100"/>
-              <w:bottom w:type="dxa" w:w="80"/>
-              <w:right w:type="dxa" w:w="150"/>
+              <w:bottom w:type="dxa" w:w="60"/>
+              <w:right w:type="dxa" w:w="120"/>
             </w:tcMar>
             <w:vAlign w:val="center"/>
           </w:tcPr>
@@ -2966,16 +2974,16 @@
           <w:tcPr>
             <w:tcW w:type="dxa" w:w="1372"/>
             <w:tcBorders>
-              <w:top w:val="single" w:color="000000" w:sz="4"/>
-              <w:left w:val="single" w:color="000000" w:sz="4"/>
-              <w:bottom w:val="single" w:color="000000" w:sz="4"/>
-              <w:right w:val="single" w:color="000000" w:sz="4"/>
-            </w:tcBorders>
-            <w:tcMar>
-              <w:top w:type="dxa" w:w="80"/>
+              <w:top w:val="single" w:color="767171" w:sz="2"/>
+              <w:left w:val="single" w:color="767171" w:sz="2"/>
+              <w:bottom w:val="single" w:color="767171" w:sz="2"/>
+              <w:right w:val="single" w:color="767171" w:sz="2"/>
+            </w:tcBorders>
+            <w:tcMar>
+              <w:top w:type="dxa" w:w="60"/>
               <w:left w:type="dxa" w:w="100"/>
-              <w:bottom w:type="dxa" w:w="80"/>
-              <w:right w:type="dxa" w:w="150"/>
+              <w:bottom w:type="dxa" w:w="60"/>
+              <w:right w:type="dxa" w:w="120"/>
             </w:tcMar>
             <w:vAlign w:val="center"/>
           </w:tcPr>
@@ -3337,7 +3345,7 @@
       <w:headerReference w:type="default" r:id="rId7"/>
       <w:footerReference w:type="default" r:id="rId8"/>
       <w:pgSz w:w="11906" w:h="16838" w:orient="portrait"/>
-      <w:pgMar w:top="1440" w:right="1080" w:bottom="1080" w:left="1080" w:header="708" w:footer="708" w:gutter="0"/>
+      <w:pgMar w:top="1260" w:right="1080" w:bottom="900" w:left="1080" w:header="708" w:footer="708" w:gutter="0"/>
       <w:pgNumType/>
       <w:docGrid w:linePitch="360"/>
     </w:sectPr>
@@ -3448,7 +3456,7 @@
 <w:hdr xmlns:wpc="http://schemas.microsoft.com/office/word/2010/wordprocessingCanvas" xmlns:mc="http://schemas.openxmlformats.org/markup-compatibility/2006" xmlns:o="urn:schemas-microsoft-com:office:office" xmlns:r="http://schemas.openxmlformats.org/officeDocument/2006/relationships" xmlns:m="http://schemas.openxmlformats.org/officeDocument/2006/math" xmlns:v="urn:schemas-microsoft-com:vml" xmlns:wp14="http://schemas.microsoft.com/office/word/2010/wordprocessingDrawing" xmlns:wp="http://schemas.openxmlformats.org/drawingml/2006/wordprocessingDrawing" xmlns:w10="urn:schemas-microsoft-com:office:word" xmlns:w="http://schemas.openxmlformats.org/wordprocessingml/2006/main" xmlns:w14="http://schemas.microsoft.com/office/word/2010/wordml" xmlns:w15="http://schemas.microsoft.com/office/word/2012/wordml" xmlns:wpg="http://schemas.microsoft.com/office/word/2010/wordprocessingGroup" xmlns:wpi="http://schemas.microsoft.com/office/word/2010/wordprocessingInk" xmlns:wne="http://schemas.microsoft.com/office/word/2006/wordml" xmlns:wps="http://schemas.microsoft.com/office/word/2010/wordprocessingShape" xmlns:cx="http://schemas.microsoft.com/office/drawing/2014/chartex" xmlns:cx1="http://schemas.microsoft.com/office/drawing/2015/9/8/chartex" xmlns:cx2="http://schemas.microsoft.com/office/drawing/2015/10/21/chartex" xmlns:cx3="http://schemas.microsoft.com/office/drawing/2016/5/9/chartex" xmlns:cx4="http://schemas.microsoft.com/office/drawing/2016/5/10/chartex" xmlns:cx5="http://schemas.microsoft.com/office/drawing/2016/5/11/chartex" xmlns:cx6="http://schemas.microsoft.com/office/drawing/2016/5/12/chartex" xmlns:cx7="http://schemas.microsoft.com/office/drawing/2016/5/13/chartex" xmlns:cx8="http://schemas.microsoft.com/office/drawing/2016/5/14/chartex" xmlns:w16cid="http://schemas.microsoft.com/office/word/2016/wordml/cid" xmlns:w16se="http://schemas.microsoft.com/office/word/2015/wordml/symex">
   <w:tbl>
     <w:tblPr>
-      <w:tblW w:type="dxa" w:w="10620"/>
+      <w:tblW w:type="dxa" w:w="9746"/>
       <w:tblBorders>
         <w:top w:val="single" w:color="auto" w:sz="4"/>
         <w:left w:val="single" w:color="auto" w:sz="4"/>
@@ -3461,11 +3469,12 @@
     <w:tblGrid>
       <w:gridCol w:w="100"/>
       <w:gridCol w:w="100"/>
+      <w:gridCol w:w="100"/>
     </w:tblGrid>
     <w:tr>
       <w:tc>
         <w:tcPr>
-          <w:tcW w:type="dxa" w:w="2335"/>
+          <w:tcW w:type="dxa" w:w="1800"/>
           <w:vAlign w:val="center"/>
         </w:tcPr>
         <w:p>
@@ -3516,7 +3525,7 @@
       </w:tc>
       <w:tc>
         <w:tcPr>
-          <w:tcW w:type="dxa" w:w="8285"/>
+          <w:tcW w:type="dxa" w:w="6600"/>
           <w:shd w:fill="FFFFFF"/>
           <w:vAlign w:val="center"/>
         </w:tcPr>
@@ -3562,6 +3571,57 @@
           </w:r>
         </w:p>
       </w:tc>
+      <w:tc>
+        <w:tcPr>
+          <w:tcW w:type="dxa" w:w="1346"/>
+          <w:vAlign w:val="center"/>
+        </w:tcPr>
+        <w:p>
+          <w:pPr>
+            <w:jc w:val="center"/>
+          </w:pPr>
+          <w:r>
+            <w:drawing>
+              <wp:inline distT="0" distB="0" distL="0" distR="0">
+                <wp:extent cx="762000" cy="762000"/>
+                <wp:effectExtent t="0" r="0" b="0" l="0"/>
+                <wp:docPr id="1" name="" descr="" title=""/>
+                <wp:cNvGraphicFramePr>
+                  <a:graphicFrameLocks xmlns:a="http://schemas.openxmlformats.org/drawingml/2006/main" noChangeAspect="1"/>
+                </wp:cNvGraphicFramePr>
+                <a:graphic xmlns:a="http://schemas.openxmlformats.org/drawingml/2006/main">
+                  <a:graphicData uri="http://schemas.openxmlformats.org/drawingml/2006/picture">
+                    <pic:pic xmlns:pic="http://schemas.openxmlformats.org/drawingml/2006/picture">
+                      <pic:nvPicPr>
+                        <pic:cNvPr id="0" name="" descr=""/>
+                        <pic:cNvPicPr>
+                          <a:picLocks noChangeAspect="1" noChangeArrowheads="1"/>
+                        </pic:cNvPicPr>
+                      </pic:nvPicPr>
+                      <pic:blipFill>
+                        <a:blip r:embed="rId1" cstate="none"/>
+                        <a:srcRect/>
+                        <a:stretch>
+                          <a:fillRect/>
+                        </a:stretch>
+                      </pic:blipFill>
+                      <pic:spPr bwMode="auto">
+                        <a:xfrm>
+                          <a:off x="0" y="0"/>
+                          <a:ext cx="762000" cy="762000"/>
+                        </a:xfrm>
+                        <a:prstGeom prst="rect">
+                          <a:avLst/>
+                        </a:prstGeom>
+                      </pic:spPr>
+                    </pic:pic>
+                  </a:graphicData>
+                </a:graphic>
+              </wp:inline>
+            </w:drawing>
+          </w:r>
+        </w:p>
+      </w:tc>
     </w:tr>
   </w:tbl>
   <w:p>
@@ -3574,6 +3634,7 @@
         <w:rFonts w:ascii="Arial" w:cs="Arial" w:eastAsia="Arial" w:hAnsi="Arial"/>
         <w:b/>
         <w:bCs/>
+        <w:color w:val="000000"/>
         <w:sz w:val="24"/>
         <w:szCs w:val="24"/>
       </w:rPr>

</xml_diff>

<commit_message>
update fix bug export Word and  Project
</commit_message>
<xml_diff>
--- a/static/GCN_000002.docx
+++ b/static/GCN_000002.docx
@@ -149,7 +149,7 @@
                 <w:sz w:val="20"/>
                 <w:szCs w:val="20"/>
               </w:rPr>
-              <w:t xml:space="preserve">Test</w:t>
+              <w:t xml:space="preserve">–</w:t>
             </w:r>
           </w:p>
         </w:tc>
@@ -242,7 +242,7 @@
                 <w:sz w:val="20"/>
                 <w:szCs w:val="20"/>
               </w:rPr>
-              <w:t xml:space="preserve">000002</w:t>
+              <w:t xml:space="preserve">–</w:t>
             </w:r>
           </w:p>
         </w:tc>
@@ -337,7 +337,7 @@
                 <w:sz w:val="20"/>
                 <w:szCs w:val="20"/>
               </w:rPr>
-              <w:t xml:space="preserve">Test</w:t>
+              <w:t xml:space="preserve">–</w:t>
             </w:r>
           </w:p>
         </w:tc>
@@ -430,7 +430,7 @@
                 <w:sz w:val="20"/>
                 <w:szCs w:val="20"/>
               </w:rPr>
-              <w:t xml:space="preserve">01.01.2024</w:t>
+              <w:t xml:space="preserve">–</w:t>
             </w:r>
           </w:p>
         </w:tc>
@@ -525,7 +525,7 @@
                 <w:sz w:val="20"/>
                 <w:szCs w:val="20"/>
               </w:rPr>
-              <w:t xml:space="preserve">Test</w:t>
+              <w:t xml:space="preserve">–</w:t>
             </w:r>
           </w:p>
         </w:tc>
@@ -618,7 +618,7 @@
                 <w:sz w:val="20"/>
                 <w:szCs w:val="20"/>
               </w:rPr>
-              <w:t xml:space="preserve">01.01.2025</w:t>
+              <w:t xml:space="preserve">–</w:t>
             </w:r>
           </w:p>
         </w:tc>
@@ -694,7 +694,7 @@
                 <w:sz w:val="20"/>
                 <w:szCs w:val="20"/>
               </w:rPr>
-              <w:t xml:space="preserve">Test</w:t>
+              <w:t xml:space="preserve">–</w:t>
             </w:r>
           </w:p>
         </w:tc>
@@ -863,7 +863,7 @@
                 <w:sz w:val="20"/>
                 <w:szCs w:val="20"/>
               </w:rPr>
-              <w:t xml:space="preserve">Test</w:t>
+              <w:t xml:space="preserve">–</w:t>
             </w:r>
           </w:p>
         </w:tc>
@@ -1033,7 +1033,7 @@
                 <w:sz w:val="20"/>
                 <w:szCs w:val="20"/>
               </w:rPr>
-              <w:t xml:space="preserve">Test</w:t>
+              <w:t xml:space="preserve">–</w:t>
             </w:r>
           </w:p>
         </w:tc>
@@ -1271,7 +1271,7 @@
                 <w:sz w:val="20"/>
                 <w:szCs w:val="20"/>
               </w:rPr>
-              <w:t xml:space="preserve">Test</w:t>
+              <w:t xml:space="preserve">–</w:t>
             </w:r>
           </w:p>
         </w:tc>
@@ -1364,7 +1364,7 @@
                 <w:sz w:val="20"/>
                 <w:szCs w:val="20"/>
               </w:rPr>
-              <w:t xml:space="preserve">Test</w:t>
+              <w:t xml:space="preserve">–</w:t>
             </w:r>
           </w:p>
         </w:tc>
@@ -1610,7 +1610,7 @@
                 <w:sz w:val="20"/>
                 <w:szCs w:val="20"/>
               </w:rPr>
-              <w:t xml:space="preserve">Test</w:t>
+              <w:t xml:space="preserve">–</w:t>
             </w:r>
           </w:p>
           <w:p>
@@ -1780,7 +1780,7 @@
                 <w:sz w:val="20"/>
                 <w:szCs w:val="20"/>
               </w:rPr>
-              <w:t xml:space="preserve">25C</w:t>
+              <w:t xml:space="preserve">–</w:t>
             </w:r>
           </w:p>
         </w:tc>
@@ -1986,7 +1986,7 @@
                 <w:sz w:val="20"/>
                 <w:szCs w:val="20"/>
               </w:rPr>
-              <w:t xml:space="preserve">50%</w:t>
+              <w:t xml:space="preserve">–</w:t>
             </w:r>
           </w:p>
         </w:tc>
@@ -2214,7 +2214,7 @@
                 <w:sz w:val="20"/>
                 <w:szCs w:val="20"/>
               </w:rPr>
-              <w:t xml:space="preserve">Quang</w:t>
+              <w:t xml:space="preserve"/>
             </w:r>
           </w:p>
         </w:tc>
@@ -2245,7 +2245,7 @@
                 <w:sz w:val="20"/>
                 <w:szCs w:val="20"/>
               </w:rPr>
-              <w:t xml:space="preserve">Thong</w:t>
+              <w:t xml:space="preserve"/>
             </w:r>
           </w:p>
         </w:tc>
@@ -2767,6 +2767,43 @@
           </w:tcPr>
           <w:p>
             <w:pPr>
+              <w:spacing w:after="0" w:before="40"/>
+              <w:jc w:val="left"/>
+            </w:pPr>
+            <w:r>
+              <w:rPr>
+                <w:rFonts w:ascii="Arial" w:cs="Arial" w:eastAsia="Arial" w:hAnsi="Arial"/>
+                <w:b/>
+                <w:bCs/>
+                <w:i w:val="false"/>
+                <w:iCs w:val="false"/>
+                <w:color w:val="1a1a1a"/>
+                <w:sz w:val="18"/>
+                <w:szCs w:val="18"/>
+              </w:rPr>
+              <w:t xml:space="preserve">Tốc độ vắt</w:t>
+            </w:r>
+          </w:p>
+        </w:tc>
+        <w:tc>
+          <w:tcPr>
+            <w:tcW w:type="dxa" w:w="1500"/>
+            <w:tcBorders>
+              <w:top w:val="single" w:color="767171" w:sz="2"/>
+              <w:left w:val="single" w:color="767171" w:sz="2"/>
+              <w:bottom w:val="single" w:color="767171" w:sz="2"/>
+              <w:right w:val="single" w:color="767171" w:sz="2"/>
+            </w:tcBorders>
+            <w:tcMar>
+              <w:top w:type="dxa" w:w="60"/>
+              <w:left w:type="dxa" w:w="100"/>
+              <w:bottom w:type="dxa" w:w="60"/>
+              <w:right w:type="dxa" w:w="120"/>
+            </w:tcMar>
+            <w:vAlign w:val="center"/>
+          </w:tcPr>
+          <w:p>
+            <w:pPr>
               <w:spacing w:after="40" w:before="40"/>
               <w:jc w:val="center"/>
             </w:pPr>
@@ -2781,13 +2818,13 @@
                 <w:sz w:val="18"/>
                 <w:szCs w:val="18"/>
               </w:rPr>
-              <w:t xml:space="preserve">Chưa có dữ liệu</w:t>
-            </w:r>
-          </w:p>
-        </w:tc>
-        <w:tc>
-          <w:tcPr>
-            <w:tcW w:type="dxa" w:w="1500"/>
+              <w:t xml:space="preserve">20</w:t>
+            </w:r>
+          </w:p>
+        </w:tc>
+        <w:tc>
+          <w:tcPr>
+            <w:tcW w:type="dxa" w:w="1300"/>
             <w:tcBorders>
               <w:top w:val="single" w:color="767171" w:sz="2"/>
               <w:left w:val="single" w:color="767171" w:sz="2"/>
@@ -2818,13 +2855,13 @@
                 <w:sz w:val="18"/>
                 <w:szCs w:val="18"/>
               </w:rPr>
-              <w:t xml:space="preserve">Chưa có dữ liệu</w:t>
-            </w:r>
-          </w:p>
-        </w:tc>
-        <w:tc>
-          <w:tcPr>
-            <w:tcW w:type="dxa" w:w="1300"/>
+              <w:t xml:space="preserve">21 / 22 / 34</w:t>
+            </w:r>
+          </w:p>
+        </w:tc>
+        <w:tc>
+          <w:tcPr>
+            <w:tcW w:type="dxa" w:w="1200"/>
             <w:tcBorders>
               <w:top w:val="single" w:color="767171" w:sz="2"/>
               <w:left w:val="single" w:color="767171" w:sz="2"/>
@@ -2855,13 +2892,13 @@
                 <w:sz w:val="18"/>
                 <w:szCs w:val="18"/>
               </w:rPr>
-              <w:t xml:space="preserve">Chưa có dữ liệu</w:t>
-            </w:r>
-          </w:p>
-        </w:tc>
-        <w:tc>
-          <w:tcPr>
-            <w:tcW w:type="dxa" w:w="1200"/>
+              <w:t xml:space="preserve">0.3</w:t>
+            </w:r>
+          </w:p>
+        </w:tc>
+        <w:tc>
+          <w:tcPr>
+            <w:tcW w:type="dxa" w:w="1100"/>
             <w:tcBorders>
               <w:top w:val="single" w:color="767171" w:sz="2"/>
               <w:left w:val="single" w:color="767171" w:sz="2"/>
@@ -2892,7 +2929,7 @@
                 <w:sz w:val="18"/>
                 <w:szCs w:val="18"/>
               </w:rPr>
-              <w:t xml:space="preserve">Chưa có dữ liệu</w:t>
+              <w:t xml:space="preserve">± 3</w:t>
             </w:r>
           </w:p>
         </w:tc>
@@ -2929,13 +2966,13 @@
                 <w:sz w:val="18"/>
                 <w:szCs w:val="18"/>
               </w:rPr>
-              <w:t xml:space="preserve">Chưa có dữ liệu</w:t>
-            </w:r>
-          </w:p>
-        </w:tc>
-        <w:tc>
-          <w:tcPr>
-            <w:tcW w:type="dxa" w:w="1100"/>
+              <w:t xml:space="preserve">B</w:t>
+            </w:r>
+          </w:p>
+        </w:tc>
+        <w:tc>
+          <w:tcPr>
+            <w:tcW w:type="dxa" w:w="1372"/>
             <w:tcBorders>
               <w:top w:val="single" w:color="767171" w:sz="2"/>
               <w:left w:val="single" w:color="767171" w:sz="2"/>
@@ -2966,13 +3003,52 @@
                 <w:sz w:val="18"/>
                 <w:szCs w:val="18"/>
               </w:rPr>
-              <w:t xml:space="preserve">Chưa có dữ liệu</w:t>
-            </w:r>
-          </w:p>
-        </w:tc>
-        <w:tc>
-          <w:tcPr>
-            <w:tcW w:type="dxa" w:w="1372"/>
+              <w:t xml:space="preserve">LAB-TACHO.03</w:t>
+            </w:r>
+          </w:p>
+        </w:tc>
+      </w:tr>
+      <w:tr>
+        <w:tc>
+          <w:tcPr>
+            <w:tcW w:type="dxa" w:w="1500"/>
+            <w:tcBorders>
+              <w:top w:val="single" w:color="767171" w:sz="2"/>
+              <w:left w:val="single" w:color="767171" w:sz="2"/>
+              <w:bottom w:val="single" w:color="767171" w:sz="2"/>
+              <w:right w:val="single" w:color="767171" w:sz="2"/>
+            </w:tcBorders>
+            <w:tcMar>
+              <w:top w:type="dxa" w:w="60"/>
+              <w:left w:type="dxa" w:w="100"/>
+              <w:bottom w:type="dxa" w:w="60"/>
+              <w:right w:type="dxa" w:w="120"/>
+            </w:tcMar>
+            <w:vAlign w:val="center"/>
+          </w:tcPr>
+          <w:p>
+            <w:pPr>
+              <w:spacing w:after="40" w:before="40"/>
+              <w:jc w:val="left"/>
+            </w:pPr>
+            <w:r>
+              <w:rPr>
+                <w:rFonts w:ascii="Arial" w:cs="Arial" w:eastAsia="Arial" w:hAnsi="Arial"/>
+                <w:b w:val="false"/>
+                <w:bCs w:val="false"/>
+                <w:i w:val="false"/>
+                <w:iCs w:val="false"/>
+                <w:color w:val="1a1a1a"/>
+                <w:sz w:val="18"/>
+                <w:szCs w:val="18"/>
+              </w:rPr>
+              <w:t xml:space="preserve"/>
+            </w:r>
+          </w:p>
+        </w:tc>
+        <w:tc>
+          <w:tcPr>
+            <w:tcW w:type="dxa" w:w="1500"/>
             <w:tcBorders>
               <w:top w:val="single" w:color="767171" w:sz="2"/>
               <w:left w:val="single" w:color="767171" w:sz="2"/>
@@ -3003,7 +3079,714 @@
                 <w:sz w:val="18"/>
                 <w:szCs w:val="18"/>
               </w:rPr>
-              <w:t xml:space="preserve">Chưa có dữ liệu</w:t>
+              <w:t xml:space="preserve">30</w:t>
+            </w:r>
+          </w:p>
+        </w:tc>
+        <w:tc>
+          <w:tcPr>
+            <w:tcW w:type="dxa" w:w="1300"/>
+            <w:tcBorders>
+              <w:top w:val="single" w:color="767171" w:sz="2"/>
+              <w:left w:val="single" w:color="767171" w:sz="2"/>
+              <w:bottom w:val="single" w:color="767171" w:sz="2"/>
+              <w:right w:val="single" w:color="767171" w:sz="2"/>
+            </w:tcBorders>
+            <w:tcMar>
+              <w:top w:type="dxa" w:w="60"/>
+              <w:left w:type="dxa" w:w="100"/>
+              <w:bottom w:type="dxa" w:w="60"/>
+              <w:right w:type="dxa" w:w="120"/>
+            </w:tcMar>
+            <w:vAlign w:val="center"/>
+          </w:tcPr>
+          <w:p>
+            <w:pPr>
+              <w:spacing w:after="40" w:before="40"/>
+              <w:jc w:val="center"/>
+            </w:pPr>
+            <w:r>
+              <w:rPr>
+                <w:rFonts w:ascii="Arial" w:cs="Arial" w:eastAsia="Arial" w:hAnsi="Arial"/>
+                <w:b w:val="false"/>
+                <w:bCs w:val="false"/>
+                <w:i w:val="false"/>
+                <w:iCs w:val="false"/>
+                <w:color w:val="1a1a1a"/>
+                <w:sz w:val="18"/>
+                <w:szCs w:val="18"/>
+              </w:rPr>
+              <w:t xml:space="preserve">21 / 34 / 21</w:t>
+            </w:r>
+          </w:p>
+        </w:tc>
+        <w:tc>
+          <w:tcPr>
+            <w:tcW w:type="dxa" w:w="1200"/>
+            <w:tcBorders>
+              <w:top w:val="single" w:color="767171" w:sz="2"/>
+              <w:left w:val="single" w:color="767171" w:sz="2"/>
+              <w:bottom w:val="single" w:color="767171" w:sz="2"/>
+              <w:right w:val="single" w:color="767171" w:sz="2"/>
+            </w:tcBorders>
+            <w:tcMar>
+              <w:top w:type="dxa" w:w="60"/>
+              <w:left w:type="dxa" w:w="100"/>
+              <w:bottom w:type="dxa" w:w="60"/>
+              <w:right w:type="dxa" w:w="120"/>
+            </w:tcMar>
+            <w:vAlign w:val="center"/>
+          </w:tcPr>
+          <w:p>
+            <w:pPr>
+              <w:spacing w:after="40" w:before="40"/>
+              <w:jc w:val="center"/>
+            </w:pPr>
+            <w:r>
+              <w:rPr>
+                <w:rFonts w:ascii="Arial" w:cs="Arial" w:eastAsia="Arial" w:hAnsi="Arial"/>
+                <w:b w:val="false"/>
+                <w:bCs w:val="false"/>
+                <w:i w:val="false"/>
+                <w:iCs w:val="false"/>
+                <w:color w:val="1a1a1a"/>
+                <w:sz w:val="18"/>
+                <w:szCs w:val="18"/>
+              </w:rPr>
+              <w:t xml:space="preserve">0.3</w:t>
+            </w:r>
+          </w:p>
+        </w:tc>
+        <w:tc>
+          <w:tcPr>
+            <w:tcW w:type="dxa" w:w="1100"/>
+            <w:tcBorders>
+              <w:top w:val="single" w:color="767171" w:sz="2"/>
+              <w:left w:val="single" w:color="767171" w:sz="2"/>
+              <w:bottom w:val="single" w:color="767171" w:sz="2"/>
+              <w:right w:val="single" w:color="767171" w:sz="2"/>
+            </w:tcBorders>
+            <w:tcMar>
+              <w:top w:type="dxa" w:w="60"/>
+              <w:left w:type="dxa" w:w="100"/>
+              <w:bottom w:type="dxa" w:w="60"/>
+              <w:right w:type="dxa" w:w="120"/>
+            </w:tcMar>
+            <w:vAlign w:val="center"/>
+          </w:tcPr>
+          <w:p>
+            <w:pPr>
+              <w:spacing w:after="40" w:before="40"/>
+              <w:jc w:val="center"/>
+            </w:pPr>
+            <w:r>
+              <w:rPr>
+                <w:rFonts w:ascii="Arial" w:cs="Arial" w:eastAsia="Arial" w:hAnsi="Arial"/>
+                <w:b w:val="false"/>
+                <w:bCs w:val="false"/>
+                <w:i w:val="false"/>
+                <w:iCs w:val="false"/>
+                <w:color w:val="1a1a1a"/>
+                <w:sz w:val="18"/>
+                <w:szCs w:val="18"/>
+              </w:rPr>
+              <w:t xml:space="preserve">± 3</w:t>
+            </w:r>
+          </w:p>
+        </w:tc>
+        <w:tc>
+          <w:tcPr>
+            <w:tcW w:type="dxa" w:w="1100"/>
+            <w:tcBorders>
+              <w:top w:val="single" w:color="767171" w:sz="2"/>
+              <w:left w:val="single" w:color="767171" w:sz="2"/>
+              <w:bottom w:val="single" w:color="767171" w:sz="2"/>
+              <w:right w:val="single" w:color="767171" w:sz="2"/>
+            </w:tcBorders>
+            <w:tcMar>
+              <w:top w:type="dxa" w:w="60"/>
+              <w:left w:type="dxa" w:w="100"/>
+              <w:bottom w:type="dxa" w:w="60"/>
+              <w:right w:type="dxa" w:w="120"/>
+            </w:tcMar>
+            <w:vAlign w:val="center"/>
+          </w:tcPr>
+          <w:p>
+            <w:pPr>
+              <w:spacing w:after="40" w:before="40"/>
+              <w:jc w:val="center"/>
+            </w:pPr>
+            <w:r>
+              <w:rPr>
+                <w:rFonts w:ascii="Arial" w:cs="Arial" w:eastAsia="Arial" w:hAnsi="Arial"/>
+                <w:b w:val="false"/>
+                <w:bCs w:val="false"/>
+                <w:i w:val="false"/>
+                <w:iCs w:val="false"/>
+                <w:color w:val="1a1a1a"/>
+                <w:sz w:val="18"/>
+                <w:szCs w:val="18"/>
+              </w:rPr>
+              <w:t xml:space="preserve">B</w:t>
+            </w:r>
+          </w:p>
+        </w:tc>
+        <w:tc>
+          <w:tcPr>
+            <w:tcW w:type="dxa" w:w="1372"/>
+            <w:tcBorders>
+              <w:top w:val="single" w:color="767171" w:sz="2"/>
+              <w:left w:val="single" w:color="767171" w:sz="2"/>
+              <w:bottom w:val="single" w:color="767171" w:sz="2"/>
+              <w:right w:val="single" w:color="767171" w:sz="2"/>
+            </w:tcBorders>
+            <w:tcMar>
+              <w:top w:type="dxa" w:w="60"/>
+              <w:left w:type="dxa" w:w="100"/>
+              <w:bottom w:type="dxa" w:w="60"/>
+              <w:right w:type="dxa" w:w="120"/>
+            </w:tcMar>
+            <w:vAlign w:val="center"/>
+          </w:tcPr>
+          <w:p>
+            <w:pPr>
+              <w:spacing w:after="40" w:before="40"/>
+              <w:jc w:val="center"/>
+            </w:pPr>
+            <w:r>
+              <w:rPr>
+                <w:rFonts w:ascii="Arial" w:cs="Arial" w:eastAsia="Arial" w:hAnsi="Arial"/>
+                <w:b w:val="false"/>
+                <w:bCs w:val="false"/>
+                <w:i w:val="false"/>
+                <w:iCs w:val="false"/>
+                <w:color w:val="1a1a1a"/>
+                <w:sz w:val="18"/>
+                <w:szCs w:val="18"/>
+              </w:rPr>
+              <w:t xml:space="preserve">LAB-TACHO.03</w:t>
+            </w:r>
+          </w:p>
+        </w:tc>
+      </w:tr>
+      <w:tr>
+        <w:tc>
+          <w:tcPr>
+            <w:tcW w:type="dxa" w:w="1500"/>
+            <w:tcBorders>
+              <w:top w:val="single" w:color="767171" w:sz="2"/>
+              <w:left w:val="single" w:color="767171" w:sz="2"/>
+              <w:bottom w:val="single" w:color="767171" w:sz="2"/>
+              <w:right w:val="single" w:color="767171" w:sz="2"/>
+            </w:tcBorders>
+            <w:tcMar>
+              <w:top w:type="dxa" w:w="60"/>
+              <w:left w:type="dxa" w:w="100"/>
+              <w:bottom w:type="dxa" w:w="60"/>
+              <w:right w:type="dxa" w:w="120"/>
+            </w:tcMar>
+            <w:vAlign w:val="center"/>
+          </w:tcPr>
+          <w:p>
+            <w:pPr>
+              <w:spacing w:after="0" w:before="40"/>
+              <w:jc w:val="left"/>
+            </w:pPr>
+            <w:r>
+              <w:rPr>
+                <w:rFonts w:ascii="Arial" w:cs="Arial" w:eastAsia="Arial" w:hAnsi="Arial"/>
+                <w:b/>
+                <w:bCs/>
+                <w:i w:val="false"/>
+                <w:iCs w:val="false"/>
+                <w:color w:val="1a1a1a"/>
+                <w:sz w:val="18"/>
+                <w:szCs w:val="18"/>
+              </w:rPr>
+              <w:t xml:space="preserve">Mực nước</w:t>
+            </w:r>
+          </w:p>
+        </w:tc>
+        <w:tc>
+          <w:tcPr>
+            <w:tcW w:type="dxa" w:w="1500"/>
+            <w:tcBorders>
+              <w:top w:val="single" w:color="767171" w:sz="2"/>
+              <w:left w:val="single" w:color="767171" w:sz="2"/>
+              <w:bottom w:val="single" w:color="767171" w:sz="2"/>
+              <w:right w:val="single" w:color="767171" w:sz="2"/>
+            </w:tcBorders>
+            <w:tcMar>
+              <w:top w:type="dxa" w:w="60"/>
+              <w:left w:type="dxa" w:w="100"/>
+              <w:bottom w:type="dxa" w:w="60"/>
+              <w:right w:type="dxa" w:w="120"/>
+            </w:tcMar>
+            <w:vAlign w:val="center"/>
+          </w:tcPr>
+          <w:p>
+            <w:pPr>
+              <w:spacing w:after="40" w:before="40"/>
+              <w:jc w:val="center"/>
+            </w:pPr>
+            <w:r>
+              <w:rPr>
+                <w:rFonts w:ascii="Arial" w:cs="Arial" w:eastAsia="Arial" w:hAnsi="Arial"/>
+                <w:b w:val="false"/>
+                <w:bCs w:val="false"/>
+                <w:i w:val="false"/>
+                <w:iCs w:val="false"/>
+                <w:color w:val="1a1a1a"/>
+                <w:sz w:val="18"/>
+                <w:szCs w:val="18"/>
+              </w:rPr>
+              <w:t xml:space="preserve">40</w:t>
+            </w:r>
+          </w:p>
+        </w:tc>
+        <w:tc>
+          <w:tcPr>
+            <w:tcW w:type="dxa" w:w="1300"/>
+            <w:tcBorders>
+              <w:top w:val="single" w:color="767171" w:sz="2"/>
+              <w:left w:val="single" w:color="767171" w:sz="2"/>
+              <w:bottom w:val="single" w:color="767171" w:sz="2"/>
+              <w:right w:val="single" w:color="767171" w:sz="2"/>
+            </w:tcBorders>
+            <w:tcMar>
+              <w:top w:type="dxa" w:w="60"/>
+              <w:left w:type="dxa" w:w="100"/>
+              <w:bottom w:type="dxa" w:w="60"/>
+              <w:right w:type="dxa" w:w="120"/>
+            </w:tcMar>
+            <w:vAlign w:val="center"/>
+          </w:tcPr>
+          <w:p>
+            <w:pPr>
+              <w:spacing w:after="40" w:before="40"/>
+              <w:jc w:val="center"/>
+            </w:pPr>
+            <w:r>
+              <w:rPr>
+                <w:rFonts w:ascii="Arial" w:cs="Arial" w:eastAsia="Arial" w:hAnsi="Arial"/>
+                <w:b w:val="false"/>
+                <w:bCs w:val="false"/>
+                <w:i w:val="false"/>
+                <w:iCs w:val="false"/>
+                <w:color w:val="1a1a1a"/>
+                <w:sz w:val="18"/>
+                <w:szCs w:val="18"/>
+              </w:rPr>
+              <w:t xml:space="preserve">32 / 32 / 33</w:t>
+            </w:r>
+          </w:p>
+        </w:tc>
+        <w:tc>
+          <w:tcPr>
+            <w:tcW w:type="dxa" w:w="1200"/>
+            <w:tcBorders>
+              <w:top w:val="single" w:color="767171" w:sz="2"/>
+              <w:left w:val="single" w:color="767171" w:sz="2"/>
+              <w:bottom w:val="single" w:color="767171" w:sz="2"/>
+              <w:right w:val="single" w:color="767171" w:sz="2"/>
+            </w:tcBorders>
+            <w:tcMar>
+              <w:top w:type="dxa" w:w="60"/>
+              <w:left w:type="dxa" w:w="100"/>
+              <w:bottom w:type="dxa" w:w="60"/>
+              <w:right w:type="dxa" w:w="120"/>
+            </w:tcMar>
+            <w:vAlign w:val="center"/>
+          </w:tcPr>
+          <w:p>
+            <w:pPr>
+              <w:spacing w:after="40" w:before="40"/>
+              <w:jc w:val="center"/>
+            </w:pPr>
+            <w:r>
+              <w:rPr>
+                <w:rFonts w:ascii="Arial" w:cs="Arial" w:eastAsia="Arial" w:hAnsi="Arial"/>
+                <w:b w:val="false"/>
+                <w:bCs w:val="false"/>
+                <w:i w:val="false"/>
+                <w:iCs w:val="false"/>
+                <w:color w:val="1a1a1a"/>
+                <w:sz w:val="18"/>
+                <w:szCs w:val="18"/>
+              </w:rPr>
+              <w:t xml:space="preserve">0.3</w:t>
+            </w:r>
+          </w:p>
+        </w:tc>
+        <w:tc>
+          <w:tcPr>
+            <w:tcW w:type="dxa" w:w="1100"/>
+            <w:tcBorders>
+              <w:top w:val="single" w:color="767171" w:sz="2"/>
+              <w:left w:val="single" w:color="767171" w:sz="2"/>
+              <w:bottom w:val="single" w:color="767171" w:sz="2"/>
+              <w:right w:val="single" w:color="767171" w:sz="2"/>
+            </w:tcBorders>
+            <w:tcMar>
+              <w:top w:type="dxa" w:w="60"/>
+              <w:left w:type="dxa" w:w="100"/>
+              <w:bottom w:type="dxa" w:w="60"/>
+              <w:right w:type="dxa" w:w="120"/>
+            </w:tcMar>
+            <w:vAlign w:val="center"/>
+          </w:tcPr>
+          <w:p>
+            <w:pPr>
+              <w:spacing w:after="40" w:before="40"/>
+              <w:jc w:val="center"/>
+            </w:pPr>
+            <w:r>
+              <w:rPr>
+                <w:rFonts w:ascii="Arial" w:cs="Arial" w:eastAsia="Arial" w:hAnsi="Arial"/>
+                <w:b w:val="false"/>
+                <w:bCs w:val="false"/>
+                <w:i w:val="false"/>
+                <w:iCs w:val="false"/>
+                <w:color w:val="1a1a1a"/>
+                <w:sz w:val="18"/>
+                <w:szCs w:val="18"/>
+              </w:rPr>
+              <w:t xml:space="preserve">± 3</w:t>
+            </w:r>
+          </w:p>
+        </w:tc>
+        <w:tc>
+          <w:tcPr>
+            <w:tcW w:type="dxa" w:w="1100"/>
+            <w:tcBorders>
+              <w:top w:val="single" w:color="767171" w:sz="2"/>
+              <w:left w:val="single" w:color="767171" w:sz="2"/>
+              <w:bottom w:val="single" w:color="767171" w:sz="2"/>
+              <w:right w:val="single" w:color="767171" w:sz="2"/>
+            </w:tcBorders>
+            <w:tcMar>
+              <w:top w:type="dxa" w:w="60"/>
+              <w:left w:type="dxa" w:w="100"/>
+              <w:bottom w:type="dxa" w:w="60"/>
+              <w:right w:type="dxa" w:w="120"/>
+            </w:tcMar>
+            <w:vAlign w:val="center"/>
+          </w:tcPr>
+          <w:p>
+            <w:pPr>
+              <w:spacing w:after="40" w:before="40"/>
+              <w:jc w:val="center"/>
+            </w:pPr>
+            <w:r>
+              <w:rPr>
+                <w:rFonts w:ascii="Arial" w:cs="Arial" w:eastAsia="Arial" w:hAnsi="Arial"/>
+                <w:b w:val="false"/>
+                <w:bCs w:val="false"/>
+                <w:i w:val="false"/>
+                <w:iCs w:val="false"/>
+                <w:color w:val="1a1a1a"/>
+                <w:sz w:val="18"/>
+                <w:szCs w:val="18"/>
+              </w:rPr>
+              <w:t xml:space="preserve">B</w:t>
+            </w:r>
+          </w:p>
+        </w:tc>
+        <w:tc>
+          <w:tcPr>
+            <w:tcW w:type="dxa" w:w="1372"/>
+            <w:tcBorders>
+              <w:top w:val="single" w:color="767171" w:sz="2"/>
+              <w:left w:val="single" w:color="767171" w:sz="2"/>
+              <w:bottom w:val="single" w:color="767171" w:sz="2"/>
+              <w:right w:val="single" w:color="767171" w:sz="2"/>
+            </w:tcBorders>
+            <w:tcMar>
+              <w:top w:type="dxa" w:w="60"/>
+              <w:left w:type="dxa" w:w="100"/>
+              <w:bottom w:type="dxa" w:w="60"/>
+              <w:right w:type="dxa" w:w="120"/>
+            </w:tcMar>
+            <w:vAlign w:val="center"/>
+          </w:tcPr>
+          <w:p>
+            <w:pPr>
+              <w:spacing w:after="40" w:before="40"/>
+              <w:jc w:val="center"/>
+            </w:pPr>
+            <w:r>
+              <w:rPr>
+                <w:rFonts w:ascii="Arial" w:cs="Arial" w:eastAsia="Arial" w:hAnsi="Arial"/>
+                <w:b w:val="false"/>
+                <w:bCs w:val="false"/>
+                <w:i w:val="false"/>
+                <w:iCs w:val="false"/>
+                <w:color w:val="1a1a1a"/>
+                <w:sz w:val="18"/>
+                <w:szCs w:val="18"/>
+              </w:rPr>
+              <w:t xml:space="preserve">LAB-ANGLE.01</w:t>
+            </w:r>
+          </w:p>
+        </w:tc>
+      </w:tr>
+      <w:tr>
+        <w:tc>
+          <w:tcPr>
+            <w:tcW w:type="dxa" w:w="1500"/>
+            <w:tcBorders>
+              <w:top w:val="single" w:color="767171" w:sz="2"/>
+              <w:left w:val="single" w:color="767171" w:sz="2"/>
+              <w:bottom w:val="single" w:color="767171" w:sz="2"/>
+              <w:right w:val="single" w:color="767171" w:sz="2"/>
+            </w:tcBorders>
+            <w:tcMar>
+              <w:top w:type="dxa" w:w="60"/>
+              <w:left w:type="dxa" w:w="100"/>
+              <w:bottom w:type="dxa" w:w="60"/>
+              <w:right w:type="dxa" w:w="120"/>
+            </w:tcMar>
+            <w:vAlign w:val="center"/>
+          </w:tcPr>
+          <w:p>
+            <w:pPr>
+              <w:spacing w:after="0" w:before="40"/>
+              <w:jc w:val="left"/>
+            </w:pPr>
+            <w:r>
+              <w:rPr>
+                <w:rFonts w:ascii="Arial" w:cs="Arial" w:eastAsia="Arial" w:hAnsi="Arial"/>
+                <w:b/>
+                <w:bCs/>
+                <w:i w:val="false"/>
+                <w:iCs w:val="false"/>
+                <w:color w:val="1a1a1a"/>
+                <w:sz w:val="18"/>
+                <w:szCs w:val="18"/>
+              </w:rPr>
+              <w:t xml:space="preserve">Nhiệt độ</w:t>
+            </w:r>
+          </w:p>
+        </w:tc>
+        <w:tc>
+          <w:tcPr>
+            <w:tcW w:type="dxa" w:w="1500"/>
+            <w:tcBorders>
+              <w:top w:val="single" w:color="767171" w:sz="2"/>
+              <w:left w:val="single" w:color="767171" w:sz="2"/>
+              <w:bottom w:val="single" w:color="767171" w:sz="2"/>
+              <w:right w:val="single" w:color="767171" w:sz="2"/>
+            </w:tcBorders>
+            <w:tcMar>
+              <w:top w:type="dxa" w:w="60"/>
+              <w:left w:type="dxa" w:w="100"/>
+              <w:bottom w:type="dxa" w:w="60"/>
+              <w:right w:type="dxa" w:w="120"/>
+            </w:tcMar>
+            <w:vAlign w:val="center"/>
+          </w:tcPr>
+          <w:p>
+            <w:pPr>
+              <w:spacing w:after="40" w:before="40"/>
+              <w:jc w:val="center"/>
+            </w:pPr>
+            <w:r>
+              <w:rPr>
+                <w:rFonts w:ascii="Arial" w:cs="Arial" w:eastAsia="Arial" w:hAnsi="Arial"/>
+                <w:b w:val="false"/>
+                <w:bCs w:val="false"/>
+                <w:i w:val="false"/>
+                <w:iCs w:val="false"/>
+                <w:color w:val="1a1a1a"/>
+                <w:sz w:val="18"/>
+                <w:szCs w:val="18"/>
+              </w:rPr>
+              <w:t xml:space="preserve">50</w:t>
+            </w:r>
+          </w:p>
+        </w:tc>
+        <w:tc>
+          <w:tcPr>
+            <w:tcW w:type="dxa" w:w="1300"/>
+            <w:tcBorders>
+              <w:top w:val="single" w:color="767171" w:sz="2"/>
+              <w:left w:val="single" w:color="767171" w:sz="2"/>
+              <w:bottom w:val="single" w:color="767171" w:sz="2"/>
+              <w:right w:val="single" w:color="767171" w:sz="2"/>
+            </w:tcBorders>
+            <w:tcMar>
+              <w:top w:type="dxa" w:w="60"/>
+              <w:left w:type="dxa" w:w="100"/>
+              <w:bottom w:type="dxa" w:w="60"/>
+              <w:right w:type="dxa" w:w="120"/>
+            </w:tcMar>
+            <w:vAlign w:val="center"/>
+          </w:tcPr>
+          <w:p>
+            <w:pPr>
+              <w:spacing w:after="40" w:before="40"/>
+              <w:jc w:val="center"/>
+            </w:pPr>
+            <w:r>
+              <w:rPr>
+                <w:rFonts w:ascii="Arial" w:cs="Arial" w:eastAsia="Arial" w:hAnsi="Arial"/>
+                <w:b w:val="false"/>
+                <w:bCs w:val="false"/>
+                <w:i w:val="false"/>
+                <w:iCs w:val="false"/>
+                <w:color w:val="1a1a1a"/>
+                <w:sz w:val="18"/>
+                <w:szCs w:val="18"/>
+              </w:rPr>
+              <w:t xml:space="preserve">32 / 67 / 67</w:t>
+            </w:r>
+          </w:p>
+        </w:tc>
+        <w:tc>
+          <w:tcPr>
+            <w:tcW w:type="dxa" w:w="1200"/>
+            <w:tcBorders>
+              <w:top w:val="single" w:color="767171" w:sz="2"/>
+              <w:left w:val="single" w:color="767171" w:sz="2"/>
+              <w:bottom w:val="single" w:color="767171" w:sz="2"/>
+              <w:right w:val="single" w:color="767171" w:sz="2"/>
+            </w:tcBorders>
+            <w:tcMar>
+              <w:top w:type="dxa" w:w="60"/>
+              <w:left w:type="dxa" w:w="100"/>
+              <w:bottom w:type="dxa" w:w="60"/>
+              <w:right w:type="dxa" w:w="120"/>
+            </w:tcMar>
+            <w:vAlign w:val="center"/>
+          </w:tcPr>
+          <w:p>
+            <w:pPr>
+              <w:spacing w:after="40" w:before="40"/>
+              <w:jc w:val="center"/>
+            </w:pPr>
+            <w:r>
+              <w:rPr>
+                <w:rFonts w:ascii="Arial" w:cs="Arial" w:eastAsia="Arial" w:hAnsi="Arial"/>
+                <w:b w:val="false"/>
+                <w:bCs w:val="false"/>
+                <w:i w:val="false"/>
+                <w:iCs w:val="false"/>
+                <w:color w:val="1a1a1a"/>
+                <w:sz w:val="18"/>
+                <w:szCs w:val="18"/>
+              </w:rPr>
+              <w:t xml:space="preserve">0.3</w:t>
+            </w:r>
+          </w:p>
+        </w:tc>
+        <w:tc>
+          <w:tcPr>
+            <w:tcW w:type="dxa" w:w="1100"/>
+            <w:tcBorders>
+              <w:top w:val="single" w:color="767171" w:sz="2"/>
+              <w:left w:val="single" w:color="767171" w:sz="2"/>
+              <w:bottom w:val="single" w:color="767171" w:sz="2"/>
+              <w:right w:val="single" w:color="767171" w:sz="2"/>
+            </w:tcBorders>
+            <w:tcMar>
+              <w:top w:type="dxa" w:w="60"/>
+              <w:left w:type="dxa" w:w="100"/>
+              <w:bottom w:type="dxa" w:w="60"/>
+              <w:right w:type="dxa" w:w="120"/>
+            </w:tcMar>
+            <w:vAlign w:val="center"/>
+          </w:tcPr>
+          <w:p>
+            <w:pPr>
+              <w:spacing w:after="40" w:before="40"/>
+              <w:jc w:val="center"/>
+            </w:pPr>
+            <w:r>
+              <w:rPr>
+                <w:rFonts w:ascii="Arial" w:cs="Arial" w:eastAsia="Arial" w:hAnsi="Arial"/>
+                <w:b w:val="false"/>
+                <w:bCs w:val="false"/>
+                <w:i w:val="false"/>
+                <w:iCs w:val="false"/>
+                <w:color w:val="1a1a1a"/>
+                <w:sz w:val="18"/>
+                <w:szCs w:val="18"/>
+              </w:rPr>
+              <w:t xml:space="preserve">± 3</w:t>
+            </w:r>
+          </w:p>
+        </w:tc>
+        <w:tc>
+          <w:tcPr>
+            <w:tcW w:type="dxa" w:w="1100"/>
+            <w:tcBorders>
+              <w:top w:val="single" w:color="767171" w:sz="2"/>
+              <w:left w:val="single" w:color="767171" w:sz="2"/>
+              <w:bottom w:val="single" w:color="767171" w:sz="2"/>
+              <w:right w:val="single" w:color="767171" w:sz="2"/>
+            </w:tcBorders>
+            <w:tcMar>
+              <w:top w:type="dxa" w:w="60"/>
+              <w:left w:type="dxa" w:w="100"/>
+              <w:bottom w:type="dxa" w:w="60"/>
+              <w:right w:type="dxa" w:w="120"/>
+            </w:tcMar>
+            <w:vAlign w:val="center"/>
+          </w:tcPr>
+          <w:p>
+            <w:pPr>
+              <w:spacing w:after="40" w:before="40"/>
+              <w:jc w:val="center"/>
+            </w:pPr>
+            <w:r>
+              <w:rPr>
+                <w:rFonts w:ascii="Arial" w:cs="Arial" w:eastAsia="Arial" w:hAnsi="Arial"/>
+                <w:b w:val="false"/>
+                <w:bCs w:val="false"/>
+                <w:i w:val="false"/>
+                <w:iCs w:val="false"/>
+                <w:color w:val="1a1a1a"/>
+                <w:sz w:val="18"/>
+                <w:szCs w:val="18"/>
+              </w:rPr>
+              <w:t xml:space="preserve">B</w:t>
+            </w:r>
+          </w:p>
+        </w:tc>
+        <w:tc>
+          <w:tcPr>
+            <w:tcW w:type="dxa" w:w="1372"/>
+            <w:tcBorders>
+              <w:top w:val="single" w:color="767171" w:sz="2"/>
+              <w:left w:val="single" w:color="767171" w:sz="2"/>
+              <w:bottom w:val="single" w:color="767171" w:sz="2"/>
+              <w:right w:val="single" w:color="767171" w:sz="2"/>
+            </w:tcBorders>
+            <w:tcMar>
+              <w:top w:type="dxa" w:w="60"/>
+              <w:left w:type="dxa" w:w="100"/>
+              <w:bottom w:type="dxa" w:w="60"/>
+              <w:right w:type="dxa" w:w="120"/>
+            </w:tcMar>
+            <w:vAlign w:val="center"/>
+          </w:tcPr>
+          <w:p>
+            <w:pPr>
+              <w:spacing w:after="40" w:before="40"/>
+              <w:jc w:val="center"/>
+            </w:pPr>
+            <w:r>
+              <w:rPr>
+                <w:rFonts w:ascii="Arial" w:cs="Arial" w:eastAsia="Arial" w:hAnsi="Arial"/>
+                <w:b w:val="false"/>
+                <w:bCs w:val="false"/>
+                <w:i w:val="false"/>
+                <w:iCs w:val="false"/>
+                <w:color w:val="1a1a1a"/>
+                <w:sz w:val="18"/>
+                <w:szCs w:val="18"/>
+              </w:rPr>
+              <w:t xml:space="preserve">DH2</w:t>
             </w:r>
           </w:p>
         </w:tc>
@@ -3531,7 +4314,7 @@
         </w:tcPr>
         <w:p>
           <w:pPr>
-            <w:jc w:val="right"/>
+            <w:jc w:val="center"/>
           </w:pPr>
           <w:r>
             <w:rPr>
@@ -3546,7 +4329,7 @@
         </w:p>
         <w:p>
           <w:pPr>
-            <w:jc w:val="right"/>
+            <w:jc w:val="center"/>
           </w:pPr>
           <w:r>
             <w:rPr>
@@ -3559,7 +4342,7 @@
         </w:p>
         <w:p>
           <w:pPr>
-            <w:jc w:val="right"/>
+            <w:jc w:val="center"/>
           </w:pPr>
           <w:r>
             <w:rPr>

</xml_diff>